<commit_message>
docs: struktur jadwal shift, usulan TTE QR, penomoran surat
Co-Authored-By: Claude Sonnet 5.5 <noreply@anthropic.com>
</commit_message>
<xml_diff>
--- a/docs/2026-09-28-usulan-tte-qr-manajemen.docx
+++ b/docs/2026-09-28-usulan-tte-qr-manajemen.docx
@@ -5953,35 +5953,7 @@
               <w:rPr>
                 <w:rFonts w:asciiTheme="minorHAnsi" w:hAnsiTheme="minorHAnsi" w:cstheme="minorHAnsi"/>
               </w:rPr>
-              <w:t>document_signatures menyimpan signer_id, </w:t>
-            </w:r>
-            <w:proofErr w:type="spellStart"/>
-            <w:r>
-              <w:rPr>
-                <w:rFonts w:asciiTheme="minorHAnsi" w:hAnsiTheme="minorHAnsi" w:cstheme="minorHAnsi"/>
-              </w:rPr>
-              <w:t>signer_name</w:t>
-            </w:r>
-            <w:proofErr w:type="spellEnd"/>
-            <w:r>
-              <w:rPr>
-                <w:rFonts w:asciiTheme="minorHAnsi" w:hAnsiTheme="minorHAnsi" w:cstheme="minorHAnsi"/>
-              </w:rPr>
-              <w:t>, </w:t>
-            </w:r>
-            <w:proofErr w:type="spellStart"/>
-            <w:r>
-              <w:rPr>
-                <w:rFonts w:asciiTheme="minorHAnsi" w:hAnsiTheme="minorHAnsi" w:cstheme="minorHAnsi"/>
-              </w:rPr>
-              <w:t>signer_position</w:t>
-            </w:r>
-            <w:proofErr w:type="spellEnd"/>
-            <w:r>
-              <w:rPr>
-                <w:rFonts w:asciiTheme="minorHAnsi" w:hAnsiTheme="minorHAnsi" w:cstheme="minorHAnsi"/>
-              </w:rPr>
-              <w:t xml:space="preserve"> (snapshot </w:t>
+              <w:t xml:space="preserve">document_signatures menyimpan signer_id, signer_name, signer_position (snapshot </w:t>
             </w:r>
             <w:proofErr w:type="spellStart"/>
             <w:r>
@@ -7857,16 +7829,16 @@
           <w:sz w:val="24"/>
           <w:szCs w:val="24"/>
         </w:rPr>
-        <w:t xml:space="preserve"> SP” k</w:t>
-      </w:r>
-      <w:proofErr w:type="spellStart"/>
-      <w:r>
-        <w:rPr>
-          <w:rFonts w:asciiTheme="minorHAnsi" w:hAnsiTheme="minorHAnsi" w:cstheme="minorHAnsi"/>
-          <w:sz w:val="24"/>
-          <w:szCs w:val="24"/>
-        </w:rPr>
-        <w:t>emudian</w:t>
+        <w:t xml:space="preserve"> SP” </w:t>
+      </w:r>
+      <w:proofErr w:type="spellStart"/>
+      <w:r>
+        <w:rPr>
+          <w:rFonts w:asciiTheme="minorHAnsi" w:hAnsiTheme="minorHAnsi" w:cstheme="minorHAnsi"/>
+          <w:sz w:val="24"/>
+          <w:szCs w:val="24"/>
+        </w:rPr>
+        <w:t>kemudian</w:t>
       </w:r>
       <w:proofErr w:type="spellEnd"/>
       <w:r>
@@ -14612,17 +14584,17 @@
         <w:spacing w:before="360" w:after="160"/>
         <w:rPr>
           <w:rFonts w:asciiTheme="minorHAnsi" w:hAnsiTheme="minorHAnsi" w:cstheme="minorHAnsi"/>
-          <w:sz w:val="24"/>
-          <w:szCs w:val="24"/>
+          <w:b/>
+          <w:bCs/>
         </w:rPr>
       </w:pPr>
       <w:bookmarkStart w:id="5" w:name="_Toc241489936"/>
       <w:r>
         <w:rPr>
           <w:rFonts w:asciiTheme="minorHAnsi" w:hAnsiTheme="minorHAnsi" w:cstheme="minorHAnsi"/>
+          <w:b/>
+          <w:bCs/>
           <w:color w:val="133F3C"/>
-          <w:sz w:val="24"/>
-          <w:szCs w:val="24"/>
         </w:rPr>
         <w:t xml:space="preserve">7. Manfaat </w:t>
       </w:r>
@@ -14630,9 +14602,9 @@
       <w:r>
         <w:rPr>
           <w:rFonts w:asciiTheme="minorHAnsi" w:hAnsiTheme="minorHAnsi" w:cstheme="minorHAnsi"/>
+          <w:b/>
+          <w:bCs/>
           <w:color w:val="133F3C"/>
-          <w:sz w:val="24"/>
-          <w:szCs w:val="24"/>
         </w:rPr>
         <w:t>bagi</w:t>
       </w:r>
@@ -14640,9 +14612,9 @@
       <w:r>
         <w:rPr>
           <w:rFonts w:asciiTheme="minorHAnsi" w:hAnsiTheme="minorHAnsi" w:cstheme="minorHAnsi"/>
+          <w:b/>
+          <w:bCs/>
           <w:color w:val="133F3C"/>
-          <w:sz w:val="24"/>
-          <w:szCs w:val="24"/>
         </w:rPr>
         <w:t xml:space="preserve"> Perusahaan</w:t>
       </w:r>
@@ -15498,6 +15470,4287 @@
         </w:rPr>
         <w:t xml:space="preserve"> internal.</w:t>
       </w:r>
+    </w:p>
+    <w:p>
+      <w:pPr>
+        <w:spacing w:after="90"/>
+        <w:ind w:left="360"/>
+        <w:rPr>
+          <w:rFonts w:asciiTheme="minorHAnsi" w:hAnsiTheme="minorHAnsi" w:cstheme="minorHAnsi"/>
+          <w:b/>
+          <w:bCs/>
+          <w:color w:val="133F3C"/>
+        </w:rPr>
+      </w:pPr>
+    </w:p>
+    <w:p>
+      <w:pPr>
+        <w:spacing w:after="90"/>
+        <w:ind w:left="360"/>
+        <w:rPr>
+          <w:rFonts w:asciiTheme="minorHAnsi" w:hAnsiTheme="minorHAnsi" w:cstheme="minorHAnsi"/>
+          <w:sz w:val="36"/>
+          <w:szCs w:val="36"/>
+        </w:rPr>
+      </w:pPr>
+      <w:proofErr w:type="spellStart"/>
+      <w:r>
+        <w:rPr>
+          <w:rFonts w:asciiTheme="minorHAnsi" w:hAnsiTheme="minorHAnsi" w:cstheme="minorHAnsi"/>
+          <w:b/>
+          <w:bCs/>
+          <w:color w:val="133F3C"/>
+          <w:sz w:val="32"/>
+          <w:szCs w:val="32"/>
+        </w:rPr>
+        <w:t>Perbedaan</w:t>
+      </w:r>
+      <w:proofErr w:type="spellEnd"/>
+      <w:r>
+        <w:rPr>
+          <w:rFonts w:asciiTheme="minorHAnsi" w:hAnsiTheme="minorHAnsi" w:cstheme="minorHAnsi"/>
+          <w:b/>
+          <w:bCs/>
+          <w:color w:val="133F3C"/>
+          <w:sz w:val="32"/>
+          <w:szCs w:val="32"/>
+        </w:rPr>
+        <w:t xml:space="preserve"> </w:t>
+      </w:r>
+      <w:proofErr w:type="spellStart"/>
+      <w:r>
+        <w:rPr>
+          <w:rFonts w:asciiTheme="minorHAnsi" w:hAnsiTheme="minorHAnsi" w:cstheme="minorHAnsi"/>
+          <w:b/>
+          <w:bCs/>
+          <w:color w:val="133F3C"/>
+          <w:sz w:val="32"/>
+          <w:szCs w:val="32"/>
+        </w:rPr>
+        <w:t>alur</w:t>
+      </w:r>
+      <w:proofErr w:type="spellEnd"/>
+      <w:r>
+        <w:rPr>
+          <w:rFonts w:asciiTheme="minorHAnsi" w:hAnsiTheme="minorHAnsi" w:cstheme="minorHAnsi"/>
+          <w:b/>
+          <w:bCs/>
+          <w:color w:val="133F3C"/>
+          <w:sz w:val="32"/>
+          <w:szCs w:val="32"/>
+        </w:rPr>
+        <w:t xml:space="preserve"> </w:t>
+      </w:r>
+      <w:proofErr w:type="spellStart"/>
+      <w:r>
+        <w:rPr>
+          <w:rFonts w:asciiTheme="minorHAnsi" w:hAnsiTheme="minorHAnsi" w:cstheme="minorHAnsi"/>
+          <w:b/>
+          <w:bCs/>
+          <w:color w:val="133F3C"/>
+          <w:sz w:val="32"/>
+          <w:szCs w:val="32"/>
+        </w:rPr>
+        <w:t>dengan</w:t>
+      </w:r>
+      <w:proofErr w:type="spellEnd"/>
+      <w:r>
+        <w:rPr>
+          <w:rFonts w:asciiTheme="minorHAnsi" w:hAnsiTheme="minorHAnsi" w:cstheme="minorHAnsi"/>
+          <w:b/>
+          <w:bCs/>
+          <w:color w:val="133F3C"/>
+          <w:sz w:val="32"/>
+          <w:szCs w:val="32"/>
+        </w:rPr>
+        <w:t xml:space="preserve"> </w:t>
+      </w:r>
+      <w:proofErr w:type="spellStart"/>
+      <w:r>
+        <w:rPr>
+          <w:rFonts w:asciiTheme="minorHAnsi" w:hAnsiTheme="minorHAnsi" w:cstheme="minorHAnsi"/>
+          <w:b/>
+          <w:bCs/>
+          <w:color w:val="133F3C"/>
+          <w:sz w:val="32"/>
+          <w:szCs w:val="32"/>
+        </w:rPr>
+        <w:t>penandatangan</w:t>
+      </w:r>
+      <w:proofErr w:type="spellEnd"/>
+      <w:r>
+        <w:rPr>
+          <w:rFonts w:asciiTheme="minorHAnsi" w:hAnsiTheme="minorHAnsi" w:cstheme="minorHAnsi"/>
+          <w:b/>
+          <w:bCs/>
+          <w:color w:val="133F3C"/>
+          <w:sz w:val="32"/>
+          <w:szCs w:val="32"/>
+        </w:rPr>
+        <w:t xml:space="preserve"> </w:t>
+      </w:r>
+      <w:proofErr w:type="spellStart"/>
+      <w:r>
+        <w:rPr>
+          <w:rFonts w:asciiTheme="minorHAnsi" w:hAnsiTheme="minorHAnsi" w:cstheme="minorHAnsi"/>
+          <w:b/>
+          <w:bCs/>
+          <w:color w:val="133F3C"/>
+          <w:sz w:val="32"/>
+          <w:szCs w:val="32"/>
+        </w:rPr>
+        <w:t>sarpras</w:t>
+      </w:r>
+      <w:proofErr w:type="spellEnd"/>
+    </w:p>
+    <w:p>
+      <w:pPr>
+        <w:pStyle w:val="ListParagraph"/>
+        <w:spacing w:after="90"/>
+        <w:ind w:left="720"/>
+        <w:rPr>
+          <w:rFonts w:asciiTheme="minorHAnsi" w:hAnsiTheme="minorHAnsi" w:cstheme="minorHAnsi"/>
+          <w:sz w:val="24"/>
+          <w:szCs w:val="24"/>
+        </w:rPr>
+      </w:pPr>
+    </w:p>
+    <w:tbl>
+      <w:tblPr>
+        <w:tblW w:w="0" w:type="auto"/>
+        <w:tblInd w:w="421" w:type="dxa"/>
+        <w:tblBorders>
+          <w:top w:val="single" w:sz="4" w:space="0" w:color="auto"/>
+          <w:left w:val="single" w:sz="4" w:space="0" w:color="auto"/>
+          <w:bottom w:val="single" w:sz="4" w:space="0" w:color="auto"/>
+          <w:right w:val="single" w:sz="4" w:space="0" w:color="auto"/>
+          <w:insideH w:val="single" w:sz="4" w:space="0" w:color="auto"/>
+          <w:insideV w:val="single" w:sz="4" w:space="0" w:color="auto"/>
+        </w:tblBorders>
+        <w:shd w:val="clear" w:color="auto" w:fill="FFFFFF" w:themeFill="background1"/>
+        <w:tblCellMar>
+          <w:top w:w="15" w:type="dxa"/>
+          <w:left w:w="15" w:type="dxa"/>
+          <w:bottom w:w="15" w:type="dxa"/>
+          <w:right w:w="15" w:type="dxa"/>
+        </w:tblCellMar>
+        <w:tblLook w:val="04A0" w:firstRow="1" w:lastRow="0" w:firstColumn="1" w:lastColumn="0" w:noHBand="0" w:noVBand="1"/>
+      </w:tblPr>
+      <w:tblGrid>
+        <w:gridCol w:w="1022"/>
+        <w:gridCol w:w="3599"/>
+        <w:gridCol w:w="3974"/>
+      </w:tblGrid>
+      <w:tr>
+        <w:trPr>
+          <w:tblHeader/>
+        </w:trPr>
+        <w:tc>
+          <w:tcPr>
+            <w:tcW w:w="1154" w:type="dxa"/>
+            <w:shd w:val="clear" w:color="auto" w:fill="FFFFFF" w:themeFill="background1"/>
+            <w:tcMar>
+              <w:top w:w="30" w:type="dxa"/>
+              <w:left w:w="30" w:type="dxa"/>
+              <w:bottom w:w="30" w:type="dxa"/>
+              <w:right w:w="30" w:type="dxa"/>
+            </w:tcMar>
+            <w:vAlign w:val="center"/>
+            <w:hideMark/>
+          </w:tcPr>
+          <w:p>
+            <w:pPr>
+              <w:spacing w:after="90"/>
+              <w:rPr>
+                <w:rFonts w:asciiTheme="minorHAnsi" w:hAnsiTheme="minorHAnsi" w:cstheme="minorHAnsi"/>
+                <w:b/>
+                <w:bCs/>
+                <w:sz w:val="24"/>
+                <w:szCs w:val="24"/>
+              </w:rPr>
+            </w:pPr>
+            <w:proofErr w:type="spellStart"/>
+            <w:r>
+              <w:rPr>
+                <w:rFonts w:asciiTheme="minorHAnsi" w:hAnsiTheme="minorHAnsi" w:cstheme="minorHAnsi"/>
+                <w:b/>
+                <w:bCs/>
+                <w:sz w:val="24"/>
+                <w:szCs w:val="24"/>
+              </w:rPr>
+              <w:t>Aspek</w:t>
+            </w:r>
+            <w:proofErr w:type="spellEnd"/>
+          </w:p>
+        </w:tc>
+        <w:tc>
+          <w:tcPr>
+            <w:tcW w:w="3563" w:type="dxa"/>
+            <w:shd w:val="clear" w:color="auto" w:fill="FFFFFF" w:themeFill="background1"/>
+            <w:tcMar>
+              <w:top w:w="30" w:type="dxa"/>
+              <w:left w:w="30" w:type="dxa"/>
+              <w:bottom w:w="30" w:type="dxa"/>
+              <w:right w:w="30" w:type="dxa"/>
+            </w:tcMar>
+            <w:vAlign w:val="center"/>
+            <w:hideMark/>
+          </w:tcPr>
+          <w:p>
+            <w:pPr>
+              <w:spacing w:after="90"/>
+              <w:rPr>
+                <w:rFonts w:asciiTheme="minorHAnsi" w:hAnsiTheme="minorHAnsi" w:cstheme="minorHAnsi"/>
+                <w:b/>
+                <w:bCs/>
+                <w:sz w:val="24"/>
+                <w:szCs w:val="24"/>
+              </w:rPr>
+            </w:pPr>
+            <w:r>
+              <w:rPr>
+                <w:rFonts w:asciiTheme="minorHAnsi" w:hAnsiTheme="minorHAnsi" w:cstheme="minorHAnsi"/>
+                <w:b/>
+                <w:bCs/>
+                <w:sz w:val="24"/>
+                <w:szCs w:val="24"/>
+              </w:rPr>
+              <w:t xml:space="preserve">HRIS (punya </w:t>
+            </w:r>
+            <w:proofErr w:type="spellStart"/>
+            <w:r>
+              <w:rPr>
+                <w:rFonts w:asciiTheme="minorHAnsi" w:hAnsiTheme="minorHAnsi" w:cstheme="minorHAnsi"/>
+                <w:b/>
+                <w:bCs/>
+                <w:sz w:val="24"/>
+                <w:szCs w:val="24"/>
+              </w:rPr>
+              <w:t>kita</w:t>
+            </w:r>
+            <w:proofErr w:type="spellEnd"/>
+            <w:r>
+              <w:rPr>
+                <w:rFonts w:asciiTheme="minorHAnsi" w:hAnsiTheme="minorHAnsi" w:cstheme="minorHAnsi"/>
+                <w:b/>
+                <w:bCs/>
+                <w:sz w:val="24"/>
+                <w:szCs w:val="24"/>
+              </w:rPr>
+              <w:t>)</w:t>
+            </w:r>
+          </w:p>
+        </w:tc>
+        <w:tc>
+          <w:tcPr>
+            <w:tcW w:w="0" w:type="auto"/>
+            <w:shd w:val="clear" w:color="auto" w:fill="FFFFFF" w:themeFill="background1"/>
+            <w:tcMar>
+              <w:top w:w="30" w:type="dxa"/>
+              <w:left w:w="30" w:type="dxa"/>
+              <w:bottom w:w="30" w:type="dxa"/>
+              <w:right w:w="30" w:type="dxa"/>
+            </w:tcMar>
+            <w:vAlign w:val="center"/>
+            <w:hideMark/>
+          </w:tcPr>
+          <w:p>
+            <w:pPr>
+              <w:pStyle w:val="ListParagraph"/>
+              <w:spacing w:after="90"/>
+              <w:ind w:left="720"/>
+              <w:rPr>
+                <w:rFonts w:asciiTheme="minorHAnsi" w:hAnsiTheme="minorHAnsi" w:cstheme="minorHAnsi"/>
+                <w:b/>
+                <w:bCs/>
+                <w:sz w:val="24"/>
+                <w:szCs w:val="24"/>
+              </w:rPr>
+            </w:pPr>
+            <w:proofErr w:type="spellStart"/>
+            <w:r>
+              <w:rPr>
+                <w:rFonts w:asciiTheme="minorHAnsi" w:hAnsiTheme="minorHAnsi" w:cstheme="minorHAnsi"/>
+                <w:b/>
+                <w:bCs/>
+                <w:sz w:val="24"/>
+                <w:szCs w:val="24"/>
+              </w:rPr>
+              <w:t>Sarpras</w:t>
+            </w:r>
+            <w:proofErr w:type="spellEnd"/>
+          </w:p>
+        </w:tc>
+      </w:tr>
+      <w:tr>
+        <w:tc>
+          <w:tcPr>
+            <w:tcW w:w="1154" w:type="dxa"/>
+            <w:shd w:val="clear" w:color="auto" w:fill="FFFFFF" w:themeFill="background1"/>
+            <w:tcMar>
+              <w:top w:w="30" w:type="dxa"/>
+              <w:left w:w="30" w:type="dxa"/>
+              <w:bottom w:w="30" w:type="dxa"/>
+              <w:right w:w="30" w:type="dxa"/>
+            </w:tcMar>
+            <w:hideMark/>
+          </w:tcPr>
+          <w:p>
+            <w:pPr>
+              <w:spacing w:after="90"/>
+              <w:rPr>
+                <w:rFonts w:asciiTheme="minorHAnsi" w:hAnsiTheme="minorHAnsi" w:cstheme="minorHAnsi"/>
+                <w:sz w:val="24"/>
+                <w:szCs w:val="24"/>
+              </w:rPr>
+            </w:pPr>
+            <w:r>
+              <w:rPr>
+                <w:rFonts w:asciiTheme="minorHAnsi" w:hAnsiTheme="minorHAnsi" w:cstheme="minorHAnsi"/>
+                <w:b/>
+                <w:bCs/>
+                <w:sz w:val="24"/>
+                <w:szCs w:val="24"/>
+              </w:rPr>
+              <w:t>Kode visual</w:t>
+            </w:r>
+          </w:p>
+        </w:tc>
+        <w:tc>
+          <w:tcPr>
+            <w:tcW w:w="3563" w:type="dxa"/>
+            <w:shd w:val="clear" w:color="auto" w:fill="FFFFFF" w:themeFill="background1"/>
+            <w:tcMar>
+              <w:top w:w="30" w:type="dxa"/>
+              <w:left w:w="30" w:type="dxa"/>
+              <w:bottom w:w="30" w:type="dxa"/>
+              <w:right w:w="30" w:type="dxa"/>
+            </w:tcMar>
+            <w:hideMark/>
+          </w:tcPr>
+          <w:p>
+            <w:pPr>
+              <w:spacing w:after="90"/>
+              <w:rPr>
+                <w:rFonts w:asciiTheme="minorHAnsi" w:hAnsiTheme="minorHAnsi" w:cstheme="minorHAnsi"/>
+                <w:sz w:val="24"/>
+                <w:szCs w:val="24"/>
+              </w:rPr>
+            </w:pPr>
+            <w:r>
+              <w:rPr>
+                <w:rFonts w:asciiTheme="minorHAnsi" w:hAnsiTheme="minorHAnsi" w:cstheme="minorHAnsi"/>
+                <w:sz w:val="24"/>
+                <w:szCs w:val="24"/>
+              </w:rPr>
+              <w:t>QR code (SVG)</w:t>
+            </w:r>
+          </w:p>
+        </w:tc>
+        <w:tc>
+          <w:tcPr>
+            <w:tcW w:w="0" w:type="auto"/>
+            <w:shd w:val="clear" w:color="auto" w:fill="FFFFFF" w:themeFill="background1"/>
+            <w:tcMar>
+              <w:top w:w="30" w:type="dxa"/>
+              <w:left w:w="30" w:type="dxa"/>
+              <w:bottom w:w="30" w:type="dxa"/>
+              <w:right w:w="30" w:type="dxa"/>
+            </w:tcMar>
+            <w:hideMark/>
+          </w:tcPr>
+          <w:p>
+            <w:pPr>
+              <w:spacing w:after="90"/>
+              <w:rPr>
+                <w:rFonts w:asciiTheme="minorHAnsi" w:hAnsiTheme="minorHAnsi" w:cstheme="minorHAnsi"/>
+                <w:sz w:val="24"/>
+                <w:szCs w:val="24"/>
+              </w:rPr>
+            </w:pPr>
+            <w:r>
+              <w:rPr>
+                <w:rFonts w:asciiTheme="minorHAnsi" w:hAnsiTheme="minorHAnsi" w:cstheme="minorHAnsi"/>
+                <w:sz w:val="24"/>
+                <w:szCs w:val="24"/>
+              </w:rPr>
+              <w:t>Barcode Code128 (linear)</w:t>
+            </w:r>
+          </w:p>
+        </w:tc>
+      </w:tr>
+      <w:tr>
+        <w:tc>
+          <w:tcPr>
+            <w:tcW w:w="1154" w:type="dxa"/>
+            <w:shd w:val="clear" w:color="auto" w:fill="FFFFFF" w:themeFill="background1"/>
+            <w:tcMar>
+              <w:top w:w="30" w:type="dxa"/>
+              <w:left w:w="30" w:type="dxa"/>
+              <w:bottom w:w="30" w:type="dxa"/>
+              <w:right w:w="30" w:type="dxa"/>
+            </w:tcMar>
+            <w:hideMark/>
+          </w:tcPr>
+          <w:p>
+            <w:pPr>
+              <w:spacing w:after="90"/>
+              <w:rPr>
+                <w:rFonts w:asciiTheme="minorHAnsi" w:hAnsiTheme="minorHAnsi" w:cstheme="minorHAnsi"/>
+                <w:sz w:val="24"/>
+                <w:szCs w:val="24"/>
+              </w:rPr>
+            </w:pPr>
+            <w:r>
+              <w:rPr>
+                <w:rFonts w:asciiTheme="minorHAnsi" w:hAnsiTheme="minorHAnsi" w:cstheme="minorHAnsi"/>
+                <w:b/>
+                <w:bCs/>
+                <w:sz w:val="24"/>
+                <w:szCs w:val="24"/>
+              </w:rPr>
+              <w:t xml:space="preserve">Trigger </w:t>
+            </w:r>
+            <w:proofErr w:type="spellStart"/>
+            <w:r>
+              <w:rPr>
+                <w:rFonts w:asciiTheme="minorHAnsi" w:hAnsiTheme="minorHAnsi" w:cstheme="minorHAnsi"/>
+                <w:b/>
+                <w:bCs/>
+                <w:sz w:val="24"/>
+                <w:szCs w:val="24"/>
+              </w:rPr>
+              <w:t>tanda</w:t>
+            </w:r>
+            <w:proofErr w:type="spellEnd"/>
+            <w:r>
+              <w:rPr>
+                <w:rFonts w:asciiTheme="minorHAnsi" w:hAnsiTheme="minorHAnsi" w:cstheme="minorHAnsi"/>
+                <w:b/>
+                <w:bCs/>
+                <w:sz w:val="24"/>
+                <w:szCs w:val="24"/>
+              </w:rPr>
+              <w:t xml:space="preserve"> </w:t>
+            </w:r>
+            <w:proofErr w:type="spellStart"/>
+            <w:r>
+              <w:rPr>
+                <w:rFonts w:asciiTheme="minorHAnsi" w:hAnsiTheme="minorHAnsi" w:cstheme="minorHAnsi"/>
+                <w:b/>
+                <w:bCs/>
+                <w:sz w:val="24"/>
+                <w:szCs w:val="24"/>
+              </w:rPr>
+              <w:t>tangan</w:t>
+            </w:r>
+            <w:proofErr w:type="spellEnd"/>
+          </w:p>
+        </w:tc>
+        <w:tc>
+          <w:tcPr>
+            <w:tcW w:w="3563" w:type="dxa"/>
+            <w:shd w:val="clear" w:color="auto" w:fill="FFFFFF" w:themeFill="background1"/>
+            <w:tcMar>
+              <w:top w:w="30" w:type="dxa"/>
+              <w:left w:w="30" w:type="dxa"/>
+              <w:bottom w:w="30" w:type="dxa"/>
+              <w:right w:w="30" w:type="dxa"/>
+            </w:tcMar>
+            <w:hideMark/>
+          </w:tcPr>
+          <w:p>
+            <w:pPr>
+              <w:spacing w:after="90"/>
+              <w:rPr>
+                <w:rFonts w:asciiTheme="minorHAnsi" w:hAnsiTheme="minorHAnsi" w:cstheme="minorHAnsi"/>
+                <w:sz w:val="24"/>
+                <w:szCs w:val="24"/>
+              </w:rPr>
+            </w:pPr>
+            <w:r>
+              <w:rPr>
+                <w:rFonts w:asciiTheme="minorHAnsi" w:hAnsiTheme="minorHAnsi" w:cstheme="minorHAnsi"/>
+                <w:sz w:val="24"/>
+                <w:szCs w:val="24"/>
+              </w:rPr>
+              <w:t>Aksi </w:t>
+            </w:r>
+            <w:proofErr w:type="spellStart"/>
+            <w:r>
+              <w:rPr>
+                <w:rFonts w:asciiTheme="minorHAnsi" w:hAnsiTheme="minorHAnsi" w:cstheme="minorHAnsi"/>
+                <w:b/>
+                <w:bCs/>
+                <w:sz w:val="24"/>
+                <w:szCs w:val="24"/>
+              </w:rPr>
+              <w:t>terpisah</w:t>
+            </w:r>
+            <w:proofErr w:type="spellEnd"/>
+            <w:r>
+              <w:rPr>
+                <w:rFonts w:asciiTheme="minorHAnsi" w:hAnsiTheme="minorHAnsi" w:cstheme="minorHAnsi"/>
+                <w:b/>
+                <w:bCs/>
+                <w:sz w:val="24"/>
+                <w:szCs w:val="24"/>
+              </w:rPr>
+              <w:t xml:space="preserve"> &amp; </w:t>
+            </w:r>
+            <w:proofErr w:type="spellStart"/>
+            <w:r>
+              <w:rPr>
+                <w:rFonts w:asciiTheme="minorHAnsi" w:hAnsiTheme="minorHAnsi" w:cstheme="minorHAnsi"/>
+                <w:b/>
+                <w:bCs/>
+                <w:sz w:val="24"/>
+                <w:szCs w:val="24"/>
+              </w:rPr>
+              <w:t>sadar</w:t>
+            </w:r>
+            <w:proofErr w:type="spellEnd"/>
+            <w:r>
+              <w:rPr>
+                <w:rFonts w:asciiTheme="minorHAnsi" w:hAnsiTheme="minorHAnsi" w:cstheme="minorHAnsi"/>
+                <w:sz w:val="24"/>
+                <w:szCs w:val="24"/>
+              </w:rPr>
+              <w:t xml:space="preserve"> — </w:t>
+            </w:r>
+            <w:proofErr w:type="spellStart"/>
+            <w:r>
+              <w:rPr>
+                <w:rFonts w:asciiTheme="minorHAnsi" w:hAnsiTheme="minorHAnsi" w:cstheme="minorHAnsi"/>
+                <w:sz w:val="24"/>
+                <w:szCs w:val="24"/>
+              </w:rPr>
+              <w:t>klik</w:t>
+            </w:r>
+            <w:proofErr w:type="spellEnd"/>
+            <w:r>
+              <w:rPr>
+                <w:rFonts w:asciiTheme="minorHAnsi" w:hAnsiTheme="minorHAnsi" w:cstheme="minorHAnsi"/>
+                <w:sz w:val="24"/>
+                <w:szCs w:val="24"/>
+              </w:rPr>
+              <w:t xml:space="preserve"> "Tanda Tangani" → modal </w:t>
+            </w:r>
+            <w:proofErr w:type="spellStart"/>
+            <w:r>
+              <w:rPr>
+                <w:rFonts w:asciiTheme="minorHAnsi" w:hAnsiTheme="minorHAnsi" w:cstheme="minorHAnsi"/>
+                <w:sz w:val="24"/>
+                <w:szCs w:val="24"/>
+              </w:rPr>
+              <w:t>identitas</w:t>
+            </w:r>
+            <w:proofErr w:type="spellEnd"/>
+            <w:r>
+              <w:rPr>
+                <w:rFonts w:asciiTheme="minorHAnsi" w:hAnsiTheme="minorHAnsi" w:cstheme="minorHAnsi"/>
+                <w:sz w:val="24"/>
+                <w:szCs w:val="24"/>
+              </w:rPr>
+              <w:t xml:space="preserve"> → </w:t>
+            </w:r>
+            <w:proofErr w:type="spellStart"/>
+            <w:r>
+              <w:rPr>
+                <w:rFonts w:asciiTheme="minorHAnsi" w:hAnsiTheme="minorHAnsi" w:cstheme="minorHAnsi"/>
+                <w:sz w:val="24"/>
+                <w:szCs w:val="24"/>
+              </w:rPr>
+              <w:t>isi</w:t>
+            </w:r>
+            <w:proofErr w:type="spellEnd"/>
+            <w:r>
+              <w:rPr>
+                <w:rFonts w:asciiTheme="minorHAnsi" w:hAnsiTheme="minorHAnsi" w:cstheme="minorHAnsi"/>
+                <w:sz w:val="24"/>
+                <w:szCs w:val="24"/>
+              </w:rPr>
+              <w:t xml:space="preserve"> </w:t>
+            </w:r>
+            <w:proofErr w:type="spellStart"/>
+            <w:r>
+              <w:rPr>
+                <w:rFonts w:asciiTheme="minorHAnsi" w:hAnsiTheme="minorHAnsi" w:cstheme="minorHAnsi"/>
+                <w:sz w:val="24"/>
+                <w:szCs w:val="24"/>
+              </w:rPr>
+              <w:t>ulang</w:t>
+            </w:r>
+            <w:proofErr w:type="spellEnd"/>
+            <w:r>
+              <w:rPr>
+                <w:rFonts w:asciiTheme="minorHAnsi" w:hAnsiTheme="minorHAnsi" w:cstheme="minorHAnsi"/>
+                <w:sz w:val="24"/>
+                <w:szCs w:val="24"/>
+              </w:rPr>
+              <w:t xml:space="preserve"> password</w:t>
+            </w:r>
+          </w:p>
+        </w:tc>
+        <w:tc>
+          <w:tcPr>
+            <w:tcW w:w="0" w:type="auto"/>
+            <w:shd w:val="clear" w:color="auto" w:fill="FFFFFF" w:themeFill="background1"/>
+            <w:tcMar>
+              <w:top w:w="30" w:type="dxa"/>
+              <w:left w:w="30" w:type="dxa"/>
+              <w:bottom w:w="30" w:type="dxa"/>
+              <w:right w:w="30" w:type="dxa"/>
+            </w:tcMar>
+            <w:hideMark/>
+          </w:tcPr>
+          <w:p>
+            <w:pPr>
+              <w:spacing w:after="90"/>
+              <w:rPr>
+                <w:rFonts w:asciiTheme="minorHAnsi" w:hAnsiTheme="minorHAnsi" w:cstheme="minorHAnsi"/>
+                <w:sz w:val="24"/>
+                <w:szCs w:val="24"/>
+              </w:rPr>
+            </w:pPr>
+            <w:proofErr w:type="spellStart"/>
+            <w:r>
+              <w:rPr>
+                <w:rFonts w:asciiTheme="minorHAnsi" w:hAnsiTheme="minorHAnsi" w:cstheme="minorHAnsi"/>
+                <w:b/>
+                <w:bCs/>
+                <w:sz w:val="24"/>
+                <w:szCs w:val="24"/>
+              </w:rPr>
+              <w:t>Efek</w:t>
+            </w:r>
+            <w:proofErr w:type="spellEnd"/>
+            <w:r>
+              <w:rPr>
+                <w:rFonts w:asciiTheme="minorHAnsi" w:hAnsiTheme="minorHAnsi" w:cstheme="minorHAnsi"/>
+                <w:b/>
+                <w:bCs/>
+                <w:sz w:val="24"/>
+                <w:szCs w:val="24"/>
+              </w:rPr>
+              <w:t xml:space="preserve"> </w:t>
+            </w:r>
+            <w:proofErr w:type="spellStart"/>
+            <w:r>
+              <w:rPr>
+                <w:rFonts w:asciiTheme="minorHAnsi" w:hAnsiTheme="minorHAnsi" w:cstheme="minorHAnsi"/>
+                <w:b/>
+                <w:bCs/>
+                <w:sz w:val="24"/>
+                <w:szCs w:val="24"/>
+              </w:rPr>
+              <w:t>samping</w:t>
+            </w:r>
+            <w:proofErr w:type="spellEnd"/>
+            <w:r>
+              <w:rPr>
+                <w:rFonts w:asciiTheme="minorHAnsi" w:hAnsiTheme="minorHAnsi" w:cstheme="minorHAnsi"/>
+                <w:sz w:val="24"/>
+                <w:szCs w:val="24"/>
+              </w:rPr>
+              <w:t> </w:t>
+            </w:r>
+            <w:proofErr w:type="spellStart"/>
+            <w:r>
+              <w:rPr>
+                <w:rFonts w:asciiTheme="minorHAnsi" w:hAnsiTheme="minorHAnsi" w:cstheme="minorHAnsi"/>
+                <w:sz w:val="24"/>
+                <w:szCs w:val="24"/>
+              </w:rPr>
+              <w:t>dari</w:t>
+            </w:r>
+            <w:proofErr w:type="spellEnd"/>
+            <w:r>
+              <w:rPr>
+                <w:rFonts w:asciiTheme="minorHAnsi" w:hAnsiTheme="minorHAnsi" w:cstheme="minorHAnsi"/>
+                <w:sz w:val="24"/>
+                <w:szCs w:val="24"/>
+              </w:rPr>
+              <w:t xml:space="preserve"> </w:t>
+            </w:r>
+            <w:proofErr w:type="spellStart"/>
+            <w:r>
+              <w:rPr>
+                <w:rFonts w:asciiTheme="minorHAnsi" w:hAnsiTheme="minorHAnsi" w:cstheme="minorHAnsi"/>
+                <w:sz w:val="24"/>
+                <w:szCs w:val="24"/>
+              </w:rPr>
+              <w:t>klik</w:t>
+            </w:r>
+            <w:proofErr w:type="spellEnd"/>
+            <w:r>
+              <w:rPr>
+                <w:rFonts w:asciiTheme="minorHAnsi" w:hAnsiTheme="minorHAnsi" w:cstheme="minorHAnsi"/>
+                <w:sz w:val="24"/>
+                <w:szCs w:val="24"/>
+              </w:rPr>
+              <w:t xml:space="preserve"> </w:t>
+            </w:r>
+            <w:proofErr w:type="spellStart"/>
+            <w:r>
+              <w:rPr>
+                <w:rFonts w:asciiTheme="minorHAnsi" w:hAnsiTheme="minorHAnsi" w:cstheme="minorHAnsi"/>
+                <w:sz w:val="24"/>
+                <w:szCs w:val="24"/>
+              </w:rPr>
+              <w:t>Setujui</w:t>
+            </w:r>
+            <w:proofErr w:type="spellEnd"/>
+            <w:r>
+              <w:rPr>
+                <w:rFonts w:asciiTheme="minorHAnsi" w:hAnsiTheme="minorHAnsi" w:cstheme="minorHAnsi"/>
+                <w:sz w:val="24"/>
+                <w:szCs w:val="24"/>
+              </w:rPr>
+              <w:t>/Tolak/</w:t>
+            </w:r>
+            <w:proofErr w:type="spellStart"/>
+            <w:r>
+              <w:rPr>
+                <w:rFonts w:asciiTheme="minorHAnsi" w:hAnsiTheme="minorHAnsi" w:cstheme="minorHAnsi"/>
+                <w:sz w:val="24"/>
+                <w:szCs w:val="24"/>
+              </w:rPr>
+              <w:t>Ajukan</w:t>
+            </w:r>
+            <w:proofErr w:type="spellEnd"/>
+            <w:r>
+              <w:rPr>
+                <w:rFonts w:asciiTheme="minorHAnsi" w:hAnsiTheme="minorHAnsi" w:cstheme="minorHAnsi"/>
+                <w:sz w:val="24"/>
+                <w:szCs w:val="24"/>
+              </w:rPr>
+              <w:t xml:space="preserve"> </w:t>
+            </w:r>
+            <w:proofErr w:type="spellStart"/>
+            <w:r>
+              <w:rPr>
+                <w:rFonts w:asciiTheme="minorHAnsi" w:hAnsiTheme="minorHAnsi" w:cstheme="minorHAnsi"/>
+                <w:sz w:val="24"/>
+                <w:szCs w:val="24"/>
+              </w:rPr>
+              <w:t>biasa</w:t>
+            </w:r>
+            <w:proofErr w:type="spellEnd"/>
+            <w:r>
+              <w:rPr>
+                <w:rFonts w:asciiTheme="minorHAnsi" w:hAnsiTheme="minorHAnsi" w:cstheme="minorHAnsi"/>
+                <w:sz w:val="24"/>
+                <w:szCs w:val="24"/>
+              </w:rPr>
+              <w:t xml:space="preserve"> (</w:t>
+            </w:r>
+            <w:proofErr w:type="spellStart"/>
+            <w:r>
+              <w:rPr>
+                <w:rFonts w:asciiTheme="minorHAnsi" w:hAnsiTheme="minorHAnsi" w:cstheme="minorHAnsi"/>
+                <w:sz w:val="24"/>
+                <w:szCs w:val="24"/>
+              </w:rPr>
+              <w:t>bubuhkan_</w:t>
+            </w:r>
+            <w:proofErr w:type="gramStart"/>
+            <w:r>
+              <w:rPr>
+                <w:rFonts w:asciiTheme="minorHAnsi" w:hAnsiTheme="minorHAnsi" w:cstheme="minorHAnsi"/>
+                <w:sz w:val="24"/>
+                <w:szCs w:val="24"/>
+              </w:rPr>
+              <w:t>ttd</w:t>
+            </w:r>
+            <w:proofErr w:type="spellEnd"/>
+            <w:r>
+              <w:rPr>
+                <w:rFonts w:asciiTheme="minorHAnsi" w:hAnsiTheme="minorHAnsi" w:cstheme="minorHAnsi"/>
+                <w:sz w:val="24"/>
+                <w:szCs w:val="24"/>
+              </w:rPr>
+              <w:t>(</w:t>
+            </w:r>
+            <w:proofErr w:type="gramEnd"/>
+            <w:r>
+              <w:rPr>
+                <w:rFonts w:asciiTheme="minorHAnsi" w:hAnsiTheme="minorHAnsi" w:cstheme="minorHAnsi"/>
+                <w:sz w:val="24"/>
+                <w:szCs w:val="24"/>
+              </w:rPr>
+              <w:t>) </w:t>
+            </w:r>
+            <w:proofErr w:type="spellStart"/>
+            <w:r>
+              <w:rPr>
+                <w:rFonts w:asciiTheme="minorHAnsi" w:hAnsiTheme="minorHAnsi" w:cstheme="minorHAnsi"/>
+                <w:sz w:val="24"/>
+                <w:szCs w:val="24"/>
+              </w:rPr>
+              <w:t>dipanggil</w:t>
+            </w:r>
+            <w:proofErr w:type="spellEnd"/>
+            <w:r>
+              <w:rPr>
+                <w:rFonts w:asciiTheme="minorHAnsi" w:hAnsiTheme="minorHAnsi" w:cstheme="minorHAnsi"/>
+                <w:sz w:val="24"/>
+                <w:szCs w:val="24"/>
+              </w:rPr>
+              <w:t xml:space="preserve"> </w:t>
+            </w:r>
+            <w:proofErr w:type="spellStart"/>
+            <w:r>
+              <w:rPr>
+                <w:rFonts w:asciiTheme="minorHAnsi" w:hAnsiTheme="minorHAnsi" w:cstheme="minorHAnsi"/>
+                <w:sz w:val="24"/>
+                <w:szCs w:val="24"/>
+              </w:rPr>
+              <w:t>otomatis</w:t>
+            </w:r>
+            <w:proofErr w:type="spellEnd"/>
+            <w:r>
+              <w:rPr>
+                <w:rFonts w:asciiTheme="minorHAnsi" w:hAnsiTheme="minorHAnsi" w:cstheme="minorHAnsi"/>
+                <w:sz w:val="24"/>
+                <w:szCs w:val="24"/>
+              </w:rPr>
+              <w:t xml:space="preserve"> di </w:t>
+            </w:r>
+            <w:proofErr w:type="spellStart"/>
+            <w:r>
+              <w:rPr>
+                <w:rFonts w:asciiTheme="minorHAnsi" w:hAnsiTheme="minorHAnsi" w:cstheme="minorHAnsi"/>
+                <w:sz w:val="24"/>
+                <w:szCs w:val="24"/>
+              </w:rPr>
+              <w:t>dalam</w:t>
+            </w:r>
+            <w:proofErr w:type="spellEnd"/>
+            <w:r>
+              <w:rPr>
+                <w:rFonts w:asciiTheme="minorHAnsi" w:hAnsiTheme="minorHAnsi" w:cstheme="minorHAnsi"/>
+                <w:sz w:val="24"/>
+                <w:szCs w:val="24"/>
+              </w:rPr>
+              <w:t> </w:t>
+            </w:r>
+            <w:proofErr w:type="spellStart"/>
+            <w:r>
+              <w:rPr>
+                <w:rFonts w:asciiTheme="minorHAnsi" w:hAnsiTheme="minorHAnsi" w:cstheme="minorHAnsi"/>
+                <w:sz w:val="24"/>
+                <w:szCs w:val="24"/>
+              </w:rPr>
+              <w:t>proses.php</w:t>
+            </w:r>
+            <w:proofErr w:type="spellEnd"/>
+            <w:r>
+              <w:rPr>
+                <w:rFonts w:asciiTheme="minorHAnsi" w:hAnsiTheme="minorHAnsi" w:cstheme="minorHAnsi"/>
+                <w:sz w:val="24"/>
+                <w:szCs w:val="24"/>
+              </w:rPr>
+              <w:t xml:space="preserve">) — </w:t>
+            </w:r>
+            <w:proofErr w:type="spellStart"/>
+            <w:r>
+              <w:rPr>
+                <w:rFonts w:asciiTheme="minorHAnsi" w:hAnsiTheme="minorHAnsi" w:cstheme="minorHAnsi"/>
+                <w:sz w:val="24"/>
+                <w:szCs w:val="24"/>
+              </w:rPr>
+              <w:t>tidak</w:t>
+            </w:r>
+            <w:proofErr w:type="spellEnd"/>
+            <w:r>
+              <w:rPr>
+                <w:rFonts w:asciiTheme="minorHAnsi" w:hAnsiTheme="minorHAnsi" w:cstheme="minorHAnsi"/>
+                <w:sz w:val="24"/>
+                <w:szCs w:val="24"/>
+              </w:rPr>
+              <w:t xml:space="preserve"> </w:t>
+            </w:r>
+            <w:proofErr w:type="spellStart"/>
+            <w:r>
+              <w:rPr>
+                <w:rFonts w:asciiTheme="minorHAnsi" w:hAnsiTheme="minorHAnsi" w:cstheme="minorHAnsi"/>
+                <w:sz w:val="24"/>
+                <w:szCs w:val="24"/>
+              </w:rPr>
+              <w:t>ada</w:t>
+            </w:r>
+            <w:proofErr w:type="spellEnd"/>
+            <w:r>
+              <w:rPr>
+                <w:rFonts w:asciiTheme="minorHAnsi" w:hAnsiTheme="minorHAnsi" w:cstheme="minorHAnsi"/>
+                <w:sz w:val="24"/>
+                <w:szCs w:val="24"/>
+              </w:rPr>
+              <w:t xml:space="preserve"> </w:t>
+            </w:r>
+            <w:proofErr w:type="spellStart"/>
+            <w:r>
+              <w:rPr>
+                <w:rFonts w:asciiTheme="minorHAnsi" w:hAnsiTheme="minorHAnsi" w:cstheme="minorHAnsi"/>
+                <w:sz w:val="24"/>
+                <w:szCs w:val="24"/>
+              </w:rPr>
+              <w:t>langkah</w:t>
+            </w:r>
+            <w:proofErr w:type="spellEnd"/>
+            <w:r>
+              <w:rPr>
+                <w:rFonts w:asciiTheme="minorHAnsi" w:hAnsiTheme="minorHAnsi" w:cstheme="minorHAnsi"/>
+                <w:sz w:val="24"/>
+                <w:szCs w:val="24"/>
+              </w:rPr>
+              <w:t xml:space="preserve"> "</w:t>
+            </w:r>
+            <w:proofErr w:type="spellStart"/>
+            <w:r>
+              <w:rPr>
+                <w:rFonts w:asciiTheme="minorHAnsi" w:hAnsiTheme="minorHAnsi" w:cstheme="minorHAnsi"/>
+                <w:sz w:val="24"/>
+                <w:szCs w:val="24"/>
+              </w:rPr>
+              <w:t>menandatangani</w:t>
+            </w:r>
+            <w:proofErr w:type="spellEnd"/>
+            <w:r>
+              <w:rPr>
+                <w:rFonts w:asciiTheme="minorHAnsi" w:hAnsiTheme="minorHAnsi" w:cstheme="minorHAnsi"/>
+                <w:sz w:val="24"/>
+                <w:szCs w:val="24"/>
+              </w:rPr>
+              <w:t xml:space="preserve">" yang </w:t>
+            </w:r>
+            <w:proofErr w:type="spellStart"/>
+            <w:r>
+              <w:rPr>
+                <w:rFonts w:asciiTheme="minorHAnsi" w:hAnsiTheme="minorHAnsi" w:cstheme="minorHAnsi"/>
+                <w:sz w:val="24"/>
+                <w:szCs w:val="24"/>
+              </w:rPr>
+              <w:t>berdiri</w:t>
+            </w:r>
+            <w:proofErr w:type="spellEnd"/>
+            <w:r>
+              <w:rPr>
+                <w:rFonts w:asciiTheme="minorHAnsi" w:hAnsiTheme="minorHAnsi" w:cstheme="minorHAnsi"/>
+                <w:sz w:val="24"/>
+                <w:szCs w:val="24"/>
+              </w:rPr>
+              <w:t xml:space="preserve"> </w:t>
+            </w:r>
+            <w:proofErr w:type="spellStart"/>
+            <w:r>
+              <w:rPr>
+                <w:rFonts w:asciiTheme="minorHAnsi" w:hAnsiTheme="minorHAnsi" w:cstheme="minorHAnsi"/>
+                <w:sz w:val="24"/>
+                <w:szCs w:val="24"/>
+              </w:rPr>
+              <w:t>sendiri</w:t>
+            </w:r>
+            <w:proofErr w:type="spellEnd"/>
+          </w:p>
+        </w:tc>
+      </w:tr>
+      <w:tr>
+        <w:tc>
+          <w:tcPr>
+            <w:tcW w:w="1154" w:type="dxa"/>
+            <w:shd w:val="clear" w:color="auto" w:fill="FFFFFF" w:themeFill="background1"/>
+            <w:tcMar>
+              <w:top w:w="30" w:type="dxa"/>
+              <w:left w:w="30" w:type="dxa"/>
+              <w:bottom w:w="30" w:type="dxa"/>
+              <w:right w:w="30" w:type="dxa"/>
+            </w:tcMar>
+            <w:hideMark/>
+          </w:tcPr>
+          <w:p>
+            <w:pPr>
+              <w:spacing w:after="90"/>
+              <w:rPr>
+                <w:rFonts w:asciiTheme="minorHAnsi" w:hAnsiTheme="minorHAnsi" w:cstheme="minorHAnsi"/>
+                <w:sz w:val="24"/>
+                <w:szCs w:val="24"/>
+              </w:rPr>
+            </w:pPr>
+            <w:r>
+              <w:rPr>
+                <w:rFonts w:asciiTheme="minorHAnsi" w:hAnsiTheme="minorHAnsi" w:cstheme="minorHAnsi"/>
+                <w:b/>
+                <w:bCs/>
+                <w:sz w:val="24"/>
+                <w:szCs w:val="24"/>
+              </w:rPr>
+              <w:t xml:space="preserve">Konsen </w:t>
+            </w:r>
+            <w:proofErr w:type="spellStart"/>
+            <w:r>
+              <w:rPr>
+                <w:rFonts w:asciiTheme="minorHAnsi" w:hAnsiTheme="minorHAnsi" w:cstheme="minorHAnsi"/>
+                <w:b/>
+                <w:bCs/>
+                <w:sz w:val="24"/>
+                <w:szCs w:val="24"/>
+              </w:rPr>
+              <w:t>eksplisit</w:t>
+            </w:r>
+            <w:proofErr w:type="spellEnd"/>
+          </w:p>
+        </w:tc>
+        <w:tc>
+          <w:tcPr>
+            <w:tcW w:w="3563" w:type="dxa"/>
+            <w:shd w:val="clear" w:color="auto" w:fill="FFFFFF" w:themeFill="background1"/>
+            <w:tcMar>
+              <w:top w:w="30" w:type="dxa"/>
+              <w:left w:w="30" w:type="dxa"/>
+              <w:bottom w:w="30" w:type="dxa"/>
+              <w:right w:w="30" w:type="dxa"/>
+            </w:tcMar>
+            <w:hideMark/>
+          </w:tcPr>
+          <w:p>
+            <w:pPr>
+              <w:spacing w:after="90"/>
+              <w:rPr>
+                <w:rFonts w:asciiTheme="minorHAnsi" w:hAnsiTheme="minorHAnsi" w:cstheme="minorHAnsi"/>
+                <w:sz w:val="24"/>
+                <w:szCs w:val="24"/>
+              </w:rPr>
+            </w:pPr>
+            <w:r>
+              <w:rPr>
+                <w:rFonts w:asciiTheme="minorHAnsi" w:hAnsiTheme="minorHAnsi" w:cstheme="minorHAnsi"/>
+                <w:sz w:val="24"/>
+                <w:szCs w:val="24"/>
+              </w:rPr>
+              <w:t xml:space="preserve">Ada — password </w:t>
+            </w:r>
+            <w:proofErr w:type="spellStart"/>
+            <w:r>
+              <w:rPr>
+                <w:rFonts w:asciiTheme="minorHAnsi" w:hAnsiTheme="minorHAnsi" w:cstheme="minorHAnsi"/>
+                <w:sz w:val="24"/>
+                <w:szCs w:val="24"/>
+              </w:rPr>
+              <w:t>akundikonfirmasi</w:t>
+            </w:r>
+            <w:proofErr w:type="spellEnd"/>
+            <w:r>
+              <w:rPr>
+                <w:rFonts w:asciiTheme="minorHAnsi" w:hAnsiTheme="minorHAnsi" w:cstheme="minorHAnsi"/>
+                <w:sz w:val="24"/>
+                <w:szCs w:val="24"/>
+              </w:rPr>
+              <w:t xml:space="preserve"> </w:t>
+            </w:r>
+            <w:proofErr w:type="spellStart"/>
+            <w:r>
+              <w:rPr>
+                <w:rFonts w:asciiTheme="minorHAnsi" w:hAnsiTheme="minorHAnsi" w:cstheme="minorHAnsi"/>
+                <w:sz w:val="24"/>
+                <w:szCs w:val="24"/>
+              </w:rPr>
+              <w:t>ulang</w:t>
+            </w:r>
+            <w:proofErr w:type="spellEnd"/>
+            <w:r>
+              <w:rPr>
+                <w:rFonts w:asciiTheme="minorHAnsi" w:hAnsiTheme="minorHAnsi" w:cstheme="minorHAnsi"/>
+                <w:sz w:val="24"/>
+                <w:szCs w:val="24"/>
+              </w:rPr>
+              <w:t xml:space="preserve"> </w:t>
+            </w:r>
+            <w:proofErr w:type="spellStart"/>
+            <w:r>
+              <w:rPr>
+                <w:rFonts w:asciiTheme="minorHAnsi" w:hAnsiTheme="minorHAnsi" w:cstheme="minorHAnsi"/>
+                <w:sz w:val="24"/>
+                <w:szCs w:val="24"/>
+              </w:rPr>
+              <w:t>tepat</w:t>
+            </w:r>
+            <w:proofErr w:type="spellEnd"/>
+            <w:r>
+              <w:rPr>
+                <w:rFonts w:asciiTheme="minorHAnsi" w:hAnsiTheme="minorHAnsi" w:cstheme="minorHAnsi"/>
+                <w:sz w:val="24"/>
+                <w:szCs w:val="24"/>
+              </w:rPr>
+              <w:t xml:space="preserve"> </w:t>
+            </w:r>
+            <w:proofErr w:type="spellStart"/>
+            <w:r>
+              <w:rPr>
+                <w:rFonts w:asciiTheme="minorHAnsi" w:hAnsiTheme="minorHAnsi" w:cstheme="minorHAnsi"/>
+                <w:sz w:val="24"/>
+                <w:szCs w:val="24"/>
+              </w:rPr>
+              <w:t>sebelum</w:t>
+            </w:r>
+            <w:proofErr w:type="spellEnd"/>
+            <w:r>
+              <w:rPr>
+                <w:rFonts w:asciiTheme="minorHAnsi" w:hAnsiTheme="minorHAnsi" w:cstheme="minorHAnsi"/>
+                <w:sz w:val="24"/>
+                <w:szCs w:val="24"/>
+              </w:rPr>
+              <w:t xml:space="preserve"> </w:t>
+            </w:r>
+            <w:proofErr w:type="spellStart"/>
+            <w:r>
+              <w:rPr>
+                <w:rFonts w:asciiTheme="minorHAnsi" w:hAnsiTheme="minorHAnsi" w:cstheme="minorHAnsi"/>
+                <w:sz w:val="24"/>
+                <w:szCs w:val="24"/>
+              </w:rPr>
+              <w:t>tersimpan</w:t>
+            </w:r>
+            <w:proofErr w:type="spellEnd"/>
+          </w:p>
+        </w:tc>
+        <w:tc>
+          <w:tcPr>
+            <w:tcW w:w="0" w:type="auto"/>
+            <w:shd w:val="clear" w:color="auto" w:fill="FFFFFF" w:themeFill="background1"/>
+            <w:tcMar>
+              <w:top w:w="30" w:type="dxa"/>
+              <w:left w:w="30" w:type="dxa"/>
+              <w:bottom w:w="30" w:type="dxa"/>
+              <w:right w:w="30" w:type="dxa"/>
+            </w:tcMar>
+            <w:hideMark/>
+          </w:tcPr>
+          <w:p>
+            <w:pPr>
+              <w:spacing w:after="90"/>
+              <w:rPr>
+                <w:rFonts w:asciiTheme="minorHAnsi" w:hAnsiTheme="minorHAnsi" w:cstheme="minorHAnsi"/>
+                <w:sz w:val="24"/>
+                <w:szCs w:val="24"/>
+              </w:rPr>
+            </w:pPr>
+            <w:r>
+              <w:rPr>
+                <w:rFonts w:asciiTheme="minorHAnsi" w:hAnsiTheme="minorHAnsi" w:cstheme="minorHAnsi"/>
+                <w:b/>
+                <w:bCs/>
+                <w:sz w:val="24"/>
+                <w:szCs w:val="24"/>
+              </w:rPr>
+              <w:t xml:space="preserve">Tidak </w:t>
+            </w:r>
+            <w:proofErr w:type="spellStart"/>
+            <w:r>
+              <w:rPr>
+                <w:rFonts w:asciiTheme="minorHAnsi" w:hAnsiTheme="minorHAnsi" w:cstheme="minorHAnsi"/>
+                <w:b/>
+                <w:bCs/>
+                <w:sz w:val="24"/>
+                <w:szCs w:val="24"/>
+              </w:rPr>
+              <w:t>ada</w:t>
+            </w:r>
+            <w:proofErr w:type="spellEnd"/>
+            <w:r>
+              <w:rPr>
+                <w:rFonts w:asciiTheme="minorHAnsi" w:hAnsiTheme="minorHAnsi" w:cstheme="minorHAnsi"/>
+                <w:sz w:val="24"/>
+                <w:szCs w:val="24"/>
+              </w:rPr>
+              <w:t xml:space="preserve"> — </w:t>
+            </w:r>
+            <w:proofErr w:type="spellStart"/>
+            <w:r>
+              <w:rPr>
+                <w:rFonts w:asciiTheme="minorHAnsi" w:hAnsiTheme="minorHAnsi" w:cstheme="minorHAnsi"/>
+                <w:sz w:val="24"/>
+                <w:szCs w:val="24"/>
+              </w:rPr>
+              <w:t>cukup</w:t>
+            </w:r>
+            <w:proofErr w:type="spellEnd"/>
+            <w:r>
+              <w:rPr>
+                <w:rFonts w:asciiTheme="minorHAnsi" w:hAnsiTheme="minorHAnsi" w:cstheme="minorHAnsi"/>
+                <w:sz w:val="24"/>
+                <w:szCs w:val="24"/>
+              </w:rPr>
+              <w:t xml:space="preserve"> </w:t>
+            </w:r>
+            <w:proofErr w:type="spellStart"/>
+            <w:r>
+              <w:rPr>
+                <w:rFonts w:asciiTheme="minorHAnsi" w:hAnsiTheme="minorHAnsi" w:cstheme="minorHAnsi"/>
+                <w:sz w:val="24"/>
+                <w:szCs w:val="24"/>
+              </w:rPr>
+              <w:t>sesi</w:t>
+            </w:r>
+            <w:proofErr w:type="spellEnd"/>
+            <w:r>
+              <w:rPr>
+                <w:rFonts w:asciiTheme="minorHAnsi" w:hAnsiTheme="minorHAnsi" w:cstheme="minorHAnsi"/>
+                <w:sz w:val="24"/>
+                <w:szCs w:val="24"/>
+              </w:rPr>
+              <w:t xml:space="preserve"> login yang </w:t>
+            </w:r>
+            <w:proofErr w:type="spellStart"/>
+            <w:r>
+              <w:rPr>
+                <w:rFonts w:asciiTheme="minorHAnsi" w:hAnsiTheme="minorHAnsi" w:cstheme="minorHAnsi"/>
+                <w:sz w:val="24"/>
+                <w:szCs w:val="24"/>
+              </w:rPr>
+              <w:t>sudah</w:t>
+            </w:r>
+            <w:proofErr w:type="spellEnd"/>
+            <w:r>
+              <w:rPr>
+                <w:rFonts w:asciiTheme="minorHAnsi" w:hAnsiTheme="minorHAnsi" w:cstheme="minorHAnsi"/>
+                <w:sz w:val="24"/>
+                <w:szCs w:val="24"/>
+              </w:rPr>
+              <w:t xml:space="preserve"> </w:t>
+            </w:r>
+            <w:proofErr w:type="spellStart"/>
+            <w:r>
+              <w:rPr>
+                <w:rFonts w:asciiTheme="minorHAnsi" w:hAnsiTheme="minorHAnsi" w:cstheme="minorHAnsi"/>
+                <w:sz w:val="24"/>
+                <w:szCs w:val="24"/>
+              </w:rPr>
+              <w:t>aktif</w:t>
+            </w:r>
+            <w:proofErr w:type="spellEnd"/>
+            <w:r>
+              <w:rPr>
+                <w:rFonts w:asciiTheme="minorHAnsi" w:hAnsiTheme="minorHAnsi" w:cstheme="minorHAnsi"/>
+                <w:sz w:val="24"/>
+                <w:szCs w:val="24"/>
+              </w:rPr>
+              <w:t xml:space="preserve">, </w:t>
+            </w:r>
+            <w:proofErr w:type="spellStart"/>
+            <w:r>
+              <w:rPr>
+                <w:rFonts w:asciiTheme="minorHAnsi" w:hAnsiTheme="minorHAnsi" w:cstheme="minorHAnsi"/>
+                <w:sz w:val="24"/>
+                <w:szCs w:val="24"/>
+              </w:rPr>
+              <w:t>tidak</w:t>
+            </w:r>
+            <w:proofErr w:type="spellEnd"/>
+            <w:r>
+              <w:rPr>
+                <w:rFonts w:asciiTheme="minorHAnsi" w:hAnsiTheme="minorHAnsi" w:cstheme="minorHAnsi"/>
+                <w:sz w:val="24"/>
+                <w:szCs w:val="24"/>
+              </w:rPr>
+              <w:t xml:space="preserve"> </w:t>
+            </w:r>
+            <w:proofErr w:type="spellStart"/>
+            <w:r>
+              <w:rPr>
+                <w:rFonts w:asciiTheme="minorHAnsi" w:hAnsiTheme="minorHAnsi" w:cstheme="minorHAnsi"/>
+                <w:sz w:val="24"/>
+                <w:szCs w:val="24"/>
+              </w:rPr>
+              <w:t>ada</w:t>
+            </w:r>
+            <w:proofErr w:type="spellEnd"/>
+            <w:r>
+              <w:rPr>
+                <w:rFonts w:asciiTheme="minorHAnsi" w:hAnsiTheme="minorHAnsi" w:cstheme="minorHAnsi"/>
+                <w:sz w:val="24"/>
+                <w:szCs w:val="24"/>
+              </w:rPr>
+              <w:t xml:space="preserve"> re-</w:t>
+            </w:r>
+            <w:proofErr w:type="spellStart"/>
+            <w:r>
+              <w:rPr>
+                <w:rFonts w:asciiTheme="minorHAnsi" w:hAnsiTheme="minorHAnsi" w:cstheme="minorHAnsi"/>
+                <w:sz w:val="24"/>
+                <w:szCs w:val="24"/>
+              </w:rPr>
+              <w:t>autentikasi</w:t>
+            </w:r>
+            <w:proofErr w:type="spellEnd"/>
+            <w:r>
+              <w:rPr>
+                <w:rFonts w:asciiTheme="minorHAnsi" w:hAnsiTheme="minorHAnsi" w:cstheme="minorHAnsi"/>
+                <w:sz w:val="24"/>
+                <w:szCs w:val="24"/>
+              </w:rPr>
+              <w:t xml:space="preserve"> </w:t>
+            </w:r>
+            <w:proofErr w:type="spellStart"/>
+            <w:r>
+              <w:rPr>
+                <w:rFonts w:asciiTheme="minorHAnsi" w:hAnsiTheme="minorHAnsi" w:cstheme="minorHAnsi"/>
+                <w:sz w:val="24"/>
+                <w:szCs w:val="24"/>
+              </w:rPr>
+              <w:t>apa</w:t>
+            </w:r>
+            <w:proofErr w:type="spellEnd"/>
+            <w:r>
+              <w:rPr>
+                <w:rFonts w:asciiTheme="minorHAnsi" w:hAnsiTheme="minorHAnsi" w:cstheme="minorHAnsi"/>
+                <w:sz w:val="24"/>
+                <w:szCs w:val="24"/>
+              </w:rPr>
+              <w:t xml:space="preserve"> pun </w:t>
+            </w:r>
+            <w:proofErr w:type="spellStart"/>
+            <w:r>
+              <w:rPr>
+                <w:rFonts w:asciiTheme="minorHAnsi" w:hAnsiTheme="minorHAnsi" w:cstheme="minorHAnsi"/>
+                <w:sz w:val="24"/>
+                <w:szCs w:val="24"/>
+              </w:rPr>
+              <w:t>saat</w:t>
+            </w:r>
+            <w:proofErr w:type="spellEnd"/>
+            <w:r>
+              <w:rPr>
+                <w:rFonts w:asciiTheme="minorHAnsi" w:hAnsiTheme="minorHAnsi" w:cstheme="minorHAnsi"/>
+                <w:sz w:val="24"/>
+                <w:szCs w:val="24"/>
+              </w:rPr>
+              <w:t xml:space="preserve"> </w:t>
+            </w:r>
+            <w:proofErr w:type="spellStart"/>
+            <w:r>
+              <w:rPr>
+                <w:rFonts w:asciiTheme="minorHAnsi" w:hAnsiTheme="minorHAnsi" w:cstheme="minorHAnsi"/>
+                <w:sz w:val="24"/>
+                <w:szCs w:val="24"/>
+              </w:rPr>
+              <w:t>itu</w:t>
+            </w:r>
+            <w:proofErr w:type="spellEnd"/>
+          </w:p>
+        </w:tc>
+      </w:tr>
+      <w:tr>
+        <w:tc>
+          <w:tcPr>
+            <w:tcW w:w="1154" w:type="dxa"/>
+            <w:shd w:val="clear" w:color="auto" w:fill="FFFFFF" w:themeFill="background1"/>
+            <w:tcMar>
+              <w:top w:w="30" w:type="dxa"/>
+              <w:left w:w="30" w:type="dxa"/>
+              <w:bottom w:w="30" w:type="dxa"/>
+              <w:right w:w="30" w:type="dxa"/>
+            </w:tcMar>
+            <w:hideMark/>
+          </w:tcPr>
+          <w:p>
+            <w:pPr>
+              <w:spacing w:after="90"/>
+              <w:rPr>
+                <w:rFonts w:asciiTheme="minorHAnsi" w:hAnsiTheme="minorHAnsi" w:cstheme="minorHAnsi"/>
+                <w:sz w:val="24"/>
+                <w:szCs w:val="24"/>
+              </w:rPr>
+            </w:pPr>
+            <w:proofErr w:type="spellStart"/>
+            <w:r>
+              <w:rPr>
+                <w:rFonts w:asciiTheme="minorHAnsi" w:hAnsiTheme="minorHAnsi" w:cstheme="minorHAnsi"/>
+                <w:b/>
+                <w:bCs/>
+                <w:sz w:val="24"/>
+                <w:szCs w:val="24"/>
+              </w:rPr>
+              <w:t>Identitas</w:t>
+            </w:r>
+            <w:proofErr w:type="spellEnd"/>
+            <w:r>
+              <w:rPr>
+                <w:rFonts w:asciiTheme="minorHAnsi" w:hAnsiTheme="minorHAnsi" w:cstheme="minorHAnsi"/>
+                <w:b/>
+                <w:bCs/>
+                <w:sz w:val="24"/>
+                <w:szCs w:val="24"/>
+              </w:rPr>
+              <w:t xml:space="preserve"> </w:t>
+            </w:r>
+            <w:proofErr w:type="spellStart"/>
+            <w:r>
+              <w:rPr>
+                <w:rFonts w:asciiTheme="minorHAnsi" w:hAnsiTheme="minorHAnsi" w:cstheme="minorHAnsi"/>
+                <w:b/>
+                <w:bCs/>
+                <w:sz w:val="24"/>
+                <w:szCs w:val="24"/>
+              </w:rPr>
+              <w:t>penanda</w:t>
+            </w:r>
+            <w:proofErr w:type="spellEnd"/>
+            <w:r>
+              <w:rPr>
+                <w:rFonts w:asciiTheme="minorHAnsi" w:hAnsiTheme="minorHAnsi" w:cstheme="minorHAnsi"/>
+                <w:b/>
+                <w:bCs/>
+                <w:sz w:val="24"/>
+                <w:szCs w:val="24"/>
+              </w:rPr>
+              <w:t xml:space="preserve"> </w:t>
+            </w:r>
+            <w:proofErr w:type="spellStart"/>
+            <w:r>
+              <w:rPr>
+                <w:rFonts w:asciiTheme="minorHAnsi" w:hAnsiTheme="minorHAnsi" w:cstheme="minorHAnsi"/>
+                <w:b/>
+                <w:bCs/>
+                <w:sz w:val="24"/>
+                <w:szCs w:val="24"/>
+              </w:rPr>
+              <w:t>tangan</w:t>
+            </w:r>
+            <w:proofErr w:type="spellEnd"/>
+          </w:p>
+        </w:tc>
+        <w:tc>
+          <w:tcPr>
+            <w:tcW w:w="3563" w:type="dxa"/>
+            <w:shd w:val="clear" w:color="auto" w:fill="FFFFFF" w:themeFill="background1"/>
+            <w:tcMar>
+              <w:top w:w="30" w:type="dxa"/>
+              <w:left w:w="30" w:type="dxa"/>
+              <w:bottom w:w="30" w:type="dxa"/>
+              <w:right w:w="30" w:type="dxa"/>
+            </w:tcMar>
+            <w:hideMark/>
+          </w:tcPr>
+          <w:p>
+            <w:pPr>
+              <w:spacing w:after="90"/>
+              <w:rPr>
+                <w:rFonts w:asciiTheme="minorHAnsi" w:hAnsiTheme="minorHAnsi" w:cstheme="minorHAnsi"/>
+                <w:sz w:val="24"/>
+                <w:szCs w:val="24"/>
+              </w:rPr>
+            </w:pPr>
+            <w:proofErr w:type="spellStart"/>
+            <w:r>
+              <w:rPr>
+                <w:rFonts w:asciiTheme="minorHAnsi" w:hAnsiTheme="minorHAnsi" w:cstheme="minorHAnsi"/>
+                <w:sz w:val="24"/>
+                <w:szCs w:val="24"/>
+              </w:rPr>
+              <w:t>signer_id</w:t>
+            </w:r>
+            <w:proofErr w:type="spellEnd"/>
+            <w:r>
+              <w:rPr>
+                <w:rFonts w:asciiTheme="minorHAnsi" w:hAnsiTheme="minorHAnsi" w:cstheme="minorHAnsi"/>
+                <w:sz w:val="24"/>
+                <w:szCs w:val="24"/>
+              </w:rPr>
+              <w:t xml:space="preserve">, nama, </w:t>
+            </w:r>
+            <w:proofErr w:type="spellStart"/>
+            <w:r>
+              <w:rPr>
+                <w:rFonts w:asciiTheme="minorHAnsi" w:hAnsiTheme="minorHAnsi" w:cstheme="minorHAnsi"/>
+                <w:sz w:val="24"/>
+                <w:szCs w:val="24"/>
+              </w:rPr>
+              <w:t>jabatan</w:t>
+            </w:r>
+            <w:proofErr w:type="spellEnd"/>
+            <w:r>
+              <w:rPr>
+                <w:rFonts w:asciiTheme="minorHAnsi" w:hAnsiTheme="minorHAnsi" w:cstheme="minorHAnsi"/>
+                <w:sz w:val="24"/>
+                <w:szCs w:val="24"/>
+              </w:rPr>
+              <w:t> </w:t>
+            </w:r>
+            <w:r>
+              <w:rPr>
+                <w:rFonts w:asciiTheme="minorHAnsi" w:hAnsiTheme="minorHAnsi" w:cstheme="minorHAnsi"/>
+                <w:b/>
+                <w:bCs/>
+                <w:sz w:val="24"/>
+                <w:szCs w:val="24"/>
+              </w:rPr>
+              <w:t>snapshot</w:t>
+            </w:r>
+            <w:r>
+              <w:rPr>
+                <w:rFonts w:asciiTheme="minorHAnsi" w:hAnsiTheme="minorHAnsi" w:cstheme="minorHAnsi"/>
+                <w:sz w:val="24"/>
+                <w:szCs w:val="24"/>
+              </w:rPr>
+              <w:t> di </w:t>
+            </w:r>
+            <w:proofErr w:type="spellStart"/>
+            <w:r>
+              <w:rPr>
+                <w:rFonts w:asciiTheme="minorHAnsi" w:hAnsiTheme="minorHAnsi" w:cstheme="minorHAnsi"/>
+                <w:sz w:val="24"/>
+                <w:szCs w:val="24"/>
+              </w:rPr>
+              <w:t>document_signatures</w:t>
+            </w:r>
+            <w:proofErr w:type="spellEnd"/>
+          </w:p>
+        </w:tc>
+        <w:tc>
+          <w:tcPr>
+            <w:tcW w:w="0" w:type="auto"/>
+            <w:shd w:val="clear" w:color="auto" w:fill="FFFFFF" w:themeFill="background1"/>
+            <w:tcMar>
+              <w:top w:w="30" w:type="dxa"/>
+              <w:left w:w="30" w:type="dxa"/>
+              <w:bottom w:w="30" w:type="dxa"/>
+              <w:right w:w="30" w:type="dxa"/>
+            </w:tcMar>
+            <w:hideMark/>
+          </w:tcPr>
+          <w:p>
+            <w:pPr>
+              <w:spacing w:after="90"/>
+              <w:rPr>
+                <w:rFonts w:asciiTheme="minorHAnsi" w:hAnsiTheme="minorHAnsi" w:cstheme="minorHAnsi"/>
+                <w:sz w:val="24"/>
+                <w:szCs w:val="24"/>
+              </w:rPr>
+            </w:pPr>
+            <w:r>
+              <w:rPr>
+                <w:rFonts w:asciiTheme="minorHAnsi" w:hAnsiTheme="minorHAnsi" w:cstheme="minorHAnsi"/>
+                <w:sz w:val="24"/>
+                <w:szCs w:val="24"/>
+              </w:rPr>
+              <w:t xml:space="preserve">Sama — </w:t>
+            </w:r>
+            <w:proofErr w:type="spellStart"/>
+            <w:r>
+              <w:rPr>
+                <w:rFonts w:asciiTheme="minorHAnsi" w:hAnsiTheme="minorHAnsi" w:cstheme="minorHAnsi"/>
+                <w:sz w:val="24"/>
+                <w:szCs w:val="24"/>
+              </w:rPr>
+              <w:t>nama+jabatan</w:t>
+            </w:r>
+            <w:proofErr w:type="spellEnd"/>
+            <w:r>
+              <w:rPr>
+                <w:rFonts w:asciiTheme="minorHAnsi" w:hAnsiTheme="minorHAnsi" w:cstheme="minorHAnsi"/>
+                <w:sz w:val="24"/>
+                <w:szCs w:val="24"/>
+              </w:rPr>
+              <w:t xml:space="preserve"> </w:t>
+            </w:r>
+            <w:proofErr w:type="spellStart"/>
+            <w:r>
+              <w:rPr>
+                <w:rFonts w:asciiTheme="minorHAnsi" w:hAnsiTheme="minorHAnsi" w:cstheme="minorHAnsi"/>
+                <w:sz w:val="24"/>
+                <w:szCs w:val="24"/>
+              </w:rPr>
+              <w:t>disalin</w:t>
+            </w:r>
+            <w:proofErr w:type="spellEnd"/>
+            <w:r>
+              <w:rPr>
+                <w:rFonts w:asciiTheme="minorHAnsi" w:hAnsiTheme="minorHAnsi" w:cstheme="minorHAnsi"/>
+                <w:sz w:val="24"/>
+                <w:szCs w:val="24"/>
+              </w:rPr>
+              <w:t xml:space="preserve"> </w:t>
+            </w:r>
+            <w:proofErr w:type="spellStart"/>
+            <w:r>
+              <w:rPr>
+                <w:rFonts w:asciiTheme="minorHAnsi" w:hAnsiTheme="minorHAnsi" w:cstheme="minorHAnsi"/>
+                <w:sz w:val="24"/>
+                <w:szCs w:val="24"/>
+              </w:rPr>
+              <w:t>ke</w:t>
+            </w:r>
+            <w:proofErr w:type="spellEnd"/>
+            <w:r>
+              <w:rPr>
+                <w:rFonts w:asciiTheme="minorHAnsi" w:hAnsiTheme="minorHAnsi" w:cstheme="minorHAnsi"/>
+                <w:sz w:val="24"/>
+                <w:szCs w:val="24"/>
+              </w:rPr>
+              <w:t> </w:t>
+            </w:r>
+            <w:proofErr w:type="spellStart"/>
+            <w:r>
+              <w:rPr>
+                <w:rFonts w:asciiTheme="minorHAnsi" w:hAnsiTheme="minorHAnsi" w:cstheme="minorHAnsi"/>
+                <w:sz w:val="24"/>
+                <w:szCs w:val="24"/>
+              </w:rPr>
+              <w:t>ttd</w:t>
+            </w:r>
+            <w:proofErr w:type="spellEnd"/>
+            <w:r>
+              <w:rPr>
+                <w:rFonts w:asciiTheme="minorHAnsi" w:hAnsiTheme="minorHAnsi" w:cstheme="minorHAnsi"/>
+                <w:sz w:val="24"/>
+                <w:szCs w:val="24"/>
+              </w:rPr>
+              <w:t xml:space="preserve">, </w:t>
+            </w:r>
+            <w:proofErr w:type="spellStart"/>
+            <w:r>
+              <w:rPr>
+                <w:rFonts w:asciiTheme="minorHAnsi" w:hAnsiTheme="minorHAnsi" w:cstheme="minorHAnsi"/>
+                <w:sz w:val="24"/>
+                <w:szCs w:val="24"/>
+              </w:rPr>
+              <w:t>tidak</w:t>
+            </w:r>
+            <w:proofErr w:type="spellEnd"/>
+            <w:r>
+              <w:rPr>
+                <w:rFonts w:asciiTheme="minorHAnsi" w:hAnsiTheme="minorHAnsi" w:cstheme="minorHAnsi"/>
+                <w:sz w:val="24"/>
+                <w:szCs w:val="24"/>
+              </w:rPr>
+              <w:t xml:space="preserve"> </w:t>
+            </w:r>
+            <w:proofErr w:type="spellStart"/>
+            <w:r>
+              <w:rPr>
+                <w:rFonts w:asciiTheme="minorHAnsi" w:hAnsiTheme="minorHAnsi" w:cstheme="minorHAnsi"/>
+                <w:sz w:val="24"/>
+                <w:szCs w:val="24"/>
+              </w:rPr>
+              <w:t>dirujuk</w:t>
+            </w:r>
+            <w:proofErr w:type="spellEnd"/>
+            <w:r>
+              <w:rPr>
+                <w:rFonts w:asciiTheme="minorHAnsi" w:hAnsiTheme="minorHAnsi" w:cstheme="minorHAnsi"/>
+                <w:sz w:val="24"/>
+                <w:szCs w:val="24"/>
+              </w:rPr>
+              <w:t xml:space="preserve"> </w:t>
+            </w:r>
+            <w:proofErr w:type="spellStart"/>
+            <w:r>
+              <w:rPr>
+                <w:rFonts w:asciiTheme="minorHAnsi" w:hAnsiTheme="minorHAnsi" w:cstheme="minorHAnsi"/>
+                <w:sz w:val="24"/>
+                <w:szCs w:val="24"/>
+              </w:rPr>
+              <w:t>balik</w:t>
+            </w:r>
+            <w:proofErr w:type="spellEnd"/>
+            <w:r>
+              <w:rPr>
+                <w:rFonts w:asciiTheme="minorHAnsi" w:hAnsiTheme="minorHAnsi" w:cstheme="minorHAnsi"/>
+                <w:sz w:val="24"/>
+                <w:szCs w:val="24"/>
+              </w:rPr>
+              <w:t xml:space="preserve"> </w:t>
+            </w:r>
+            <w:proofErr w:type="spellStart"/>
+            <w:r>
+              <w:rPr>
+                <w:rFonts w:asciiTheme="minorHAnsi" w:hAnsiTheme="minorHAnsi" w:cstheme="minorHAnsi"/>
+                <w:sz w:val="24"/>
+                <w:szCs w:val="24"/>
+              </w:rPr>
+              <w:t>ke</w:t>
+            </w:r>
+            <w:proofErr w:type="spellEnd"/>
+            <w:r>
+              <w:rPr>
+                <w:rFonts w:asciiTheme="minorHAnsi" w:hAnsiTheme="minorHAnsi" w:cstheme="minorHAnsi"/>
+                <w:sz w:val="24"/>
+                <w:szCs w:val="24"/>
+              </w:rPr>
+              <w:t> users (</w:t>
+            </w:r>
+            <w:proofErr w:type="spellStart"/>
+            <w:r>
+              <w:rPr>
+                <w:rFonts w:asciiTheme="minorHAnsi" w:hAnsiTheme="minorHAnsi" w:cstheme="minorHAnsi"/>
+                <w:sz w:val="24"/>
+                <w:szCs w:val="24"/>
+              </w:rPr>
+              <w:t>poin</w:t>
+            </w:r>
+            <w:proofErr w:type="spellEnd"/>
+            <w:r>
+              <w:rPr>
+                <w:rFonts w:asciiTheme="minorHAnsi" w:hAnsiTheme="minorHAnsi" w:cstheme="minorHAnsi"/>
+                <w:sz w:val="24"/>
+                <w:szCs w:val="24"/>
+              </w:rPr>
+              <w:t xml:space="preserve"> </w:t>
+            </w:r>
+            <w:proofErr w:type="spellStart"/>
+            <w:r>
+              <w:rPr>
+                <w:rFonts w:asciiTheme="minorHAnsi" w:hAnsiTheme="minorHAnsi" w:cstheme="minorHAnsi"/>
+                <w:sz w:val="24"/>
+                <w:szCs w:val="24"/>
+              </w:rPr>
+              <w:t>bagus</w:t>
+            </w:r>
+            <w:proofErr w:type="spellEnd"/>
+            <w:r>
+              <w:rPr>
+                <w:rFonts w:asciiTheme="minorHAnsi" w:hAnsiTheme="minorHAnsi" w:cstheme="minorHAnsi"/>
+                <w:sz w:val="24"/>
+                <w:szCs w:val="24"/>
+              </w:rPr>
+              <w:t xml:space="preserve">, </w:t>
+            </w:r>
+            <w:proofErr w:type="spellStart"/>
+            <w:r>
+              <w:rPr>
+                <w:rFonts w:asciiTheme="minorHAnsi" w:hAnsiTheme="minorHAnsi" w:cstheme="minorHAnsi"/>
+                <w:sz w:val="24"/>
+                <w:szCs w:val="24"/>
+              </w:rPr>
+              <w:t>sudah</w:t>
+            </w:r>
+            <w:proofErr w:type="spellEnd"/>
+            <w:r>
+              <w:rPr>
+                <w:rFonts w:asciiTheme="minorHAnsi" w:hAnsiTheme="minorHAnsi" w:cstheme="minorHAnsi"/>
+                <w:sz w:val="24"/>
+                <w:szCs w:val="24"/>
+              </w:rPr>
+              <w:t xml:space="preserve"> </w:t>
+            </w:r>
+            <w:proofErr w:type="spellStart"/>
+            <w:r>
+              <w:rPr>
+                <w:rFonts w:asciiTheme="minorHAnsi" w:hAnsiTheme="minorHAnsi" w:cstheme="minorHAnsi"/>
+                <w:sz w:val="24"/>
+                <w:szCs w:val="24"/>
+              </w:rPr>
+              <w:t>sama</w:t>
+            </w:r>
+            <w:proofErr w:type="spellEnd"/>
+            <w:r>
+              <w:rPr>
+                <w:rFonts w:asciiTheme="minorHAnsi" w:hAnsiTheme="minorHAnsi" w:cstheme="minorHAnsi"/>
+                <w:sz w:val="24"/>
+                <w:szCs w:val="24"/>
+              </w:rPr>
+              <w:t>)</w:t>
+            </w:r>
+          </w:p>
+        </w:tc>
+      </w:tr>
+      <w:tr>
+        <w:tc>
+          <w:tcPr>
+            <w:tcW w:w="1154" w:type="dxa"/>
+            <w:shd w:val="clear" w:color="auto" w:fill="FFFFFF" w:themeFill="background1"/>
+            <w:tcMar>
+              <w:top w:w="30" w:type="dxa"/>
+              <w:left w:w="30" w:type="dxa"/>
+              <w:bottom w:w="30" w:type="dxa"/>
+              <w:right w:w="30" w:type="dxa"/>
+            </w:tcMar>
+            <w:hideMark/>
+          </w:tcPr>
+          <w:p>
+            <w:pPr>
+              <w:spacing w:after="90"/>
+              <w:rPr>
+                <w:rFonts w:asciiTheme="minorHAnsi" w:hAnsiTheme="minorHAnsi" w:cstheme="minorHAnsi"/>
+                <w:sz w:val="24"/>
+                <w:szCs w:val="24"/>
+              </w:rPr>
+            </w:pPr>
+            <w:proofErr w:type="spellStart"/>
+            <w:r>
+              <w:rPr>
+                <w:rFonts w:asciiTheme="minorHAnsi" w:hAnsiTheme="minorHAnsi" w:cstheme="minorHAnsi"/>
+                <w:b/>
+                <w:bCs/>
+                <w:sz w:val="24"/>
+                <w:szCs w:val="24"/>
+              </w:rPr>
+              <w:t>Deteksi</w:t>
+            </w:r>
+            <w:proofErr w:type="spellEnd"/>
+            <w:r>
+              <w:rPr>
+                <w:rFonts w:asciiTheme="minorHAnsi" w:hAnsiTheme="minorHAnsi" w:cstheme="minorHAnsi"/>
+                <w:b/>
+                <w:bCs/>
+                <w:sz w:val="24"/>
+                <w:szCs w:val="24"/>
+              </w:rPr>
+              <w:t xml:space="preserve"> </w:t>
+            </w:r>
+            <w:proofErr w:type="spellStart"/>
+            <w:r>
+              <w:rPr>
+                <w:rFonts w:asciiTheme="minorHAnsi" w:hAnsiTheme="minorHAnsi" w:cstheme="minorHAnsi"/>
+                <w:b/>
+                <w:bCs/>
+                <w:sz w:val="24"/>
+                <w:szCs w:val="24"/>
+              </w:rPr>
+              <w:t>perubahan</w:t>
+            </w:r>
+            <w:proofErr w:type="spellEnd"/>
+            <w:r>
+              <w:rPr>
+                <w:rFonts w:asciiTheme="minorHAnsi" w:hAnsiTheme="minorHAnsi" w:cstheme="minorHAnsi"/>
+                <w:b/>
+                <w:bCs/>
+                <w:sz w:val="24"/>
+                <w:szCs w:val="24"/>
+              </w:rPr>
+              <w:t xml:space="preserve"> </w:t>
+            </w:r>
+            <w:proofErr w:type="spellStart"/>
+            <w:r>
+              <w:rPr>
+                <w:rFonts w:asciiTheme="minorHAnsi" w:hAnsiTheme="minorHAnsi" w:cstheme="minorHAnsi"/>
+                <w:b/>
+                <w:bCs/>
+                <w:sz w:val="24"/>
+                <w:szCs w:val="24"/>
+              </w:rPr>
+              <w:t>isi</w:t>
+            </w:r>
+            <w:proofErr w:type="spellEnd"/>
+            <w:r>
+              <w:rPr>
+                <w:rFonts w:asciiTheme="minorHAnsi" w:hAnsiTheme="minorHAnsi" w:cstheme="minorHAnsi"/>
+                <w:b/>
+                <w:bCs/>
+                <w:sz w:val="24"/>
+                <w:szCs w:val="24"/>
+              </w:rPr>
+              <w:t xml:space="preserve"> (hash)</w:t>
+            </w:r>
+          </w:p>
+        </w:tc>
+        <w:tc>
+          <w:tcPr>
+            <w:tcW w:w="3563" w:type="dxa"/>
+            <w:shd w:val="clear" w:color="auto" w:fill="FFFFFF" w:themeFill="background1"/>
+            <w:tcMar>
+              <w:top w:w="30" w:type="dxa"/>
+              <w:left w:w="30" w:type="dxa"/>
+              <w:bottom w:w="30" w:type="dxa"/>
+              <w:right w:w="30" w:type="dxa"/>
+            </w:tcMar>
+            <w:hideMark/>
+          </w:tcPr>
+          <w:p>
+            <w:pPr>
+              <w:spacing w:after="90"/>
+              <w:rPr>
+                <w:rFonts w:asciiTheme="minorHAnsi" w:hAnsiTheme="minorHAnsi" w:cstheme="minorHAnsi"/>
+                <w:sz w:val="24"/>
+                <w:szCs w:val="24"/>
+              </w:rPr>
+            </w:pPr>
+            <w:r>
+              <w:rPr>
+                <w:rFonts w:asciiTheme="minorHAnsi" w:hAnsiTheme="minorHAnsi" w:cstheme="minorHAnsi"/>
+                <w:sz w:val="24"/>
+                <w:szCs w:val="24"/>
+              </w:rPr>
+              <w:t>Ada — </w:t>
+            </w:r>
+            <w:proofErr w:type="spellStart"/>
+            <w:r>
+              <w:rPr>
+                <w:rFonts w:asciiTheme="minorHAnsi" w:hAnsiTheme="minorHAnsi" w:cstheme="minorHAnsi"/>
+                <w:sz w:val="24"/>
+                <w:szCs w:val="24"/>
+              </w:rPr>
+              <w:t>document_hash</w:t>
+            </w:r>
+            <w:proofErr w:type="spellEnd"/>
+            <w:r>
+              <w:rPr>
+                <w:rFonts w:asciiTheme="minorHAnsi" w:hAnsiTheme="minorHAnsi" w:cstheme="minorHAnsi"/>
+                <w:sz w:val="24"/>
+                <w:szCs w:val="24"/>
+              </w:rPr>
+              <w:t xml:space="preserve"> SHA-256 </w:t>
+            </w:r>
+            <w:proofErr w:type="spellStart"/>
+            <w:r>
+              <w:rPr>
+                <w:rFonts w:asciiTheme="minorHAnsi" w:hAnsiTheme="minorHAnsi" w:cstheme="minorHAnsi"/>
+                <w:sz w:val="24"/>
+                <w:szCs w:val="24"/>
+              </w:rPr>
+              <w:t>dari</w:t>
+            </w:r>
+            <w:proofErr w:type="spellEnd"/>
+            <w:r>
+              <w:rPr>
+                <w:rFonts w:asciiTheme="minorHAnsi" w:hAnsiTheme="minorHAnsi" w:cstheme="minorHAnsi"/>
+                <w:sz w:val="24"/>
+                <w:szCs w:val="24"/>
+              </w:rPr>
+              <w:t> </w:t>
+            </w:r>
+            <w:proofErr w:type="spellStart"/>
+            <w:proofErr w:type="gramStart"/>
+            <w:r>
+              <w:rPr>
+                <w:rFonts w:asciiTheme="minorHAnsi" w:hAnsiTheme="minorHAnsi" w:cstheme="minorHAnsi"/>
+                <w:sz w:val="24"/>
+                <w:szCs w:val="24"/>
+              </w:rPr>
+              <w:t>signablePayload</w:t>
+            </w:r>
+            <w:proofErr w:type="spellEnd"/>
+            <w:r>
+              <w:rPr>
+                <w:rFonts w:asciiTheme="minorHAnsi" w:hAnsiTheme="minorHAnsi" w:cstheme="minorHAnsi"/>
+                <w:sz w:val="24"/>
+                <w:szCs w:val="24"/>
+              </w:rPr>
+              <w:t>(</w:t>
+            </w:r>
+            <w:proofErr w:type="gramEnd"/>
+            <w:r>
+              <w:rPr>
+                <w:rFonts w:asciiTheme="minorHAnsi" w:hAnsiTheme="minorHAnsi" w:cstheme="minorHAnsi"/>
+                <w:sz w:val="24"/>
+                <w:szCs w:val="24"/>
+              </w:rPr>
+              <w:t xml:space="preserve">), </w:t>
+            </w:r>
+            <w:proofErr w:type="spellStart"/>
+            <w:r>
+              <w:rPr>
+                <w:rFonts w:asciiTheme="minorHAnsi" w:hAnsiTheme="minorHAnsi" w:cstheme="minorHAnsi"/>
+                <w:sz w:val="24"/>
+                <w:szCs w:val="24"/>
+              </w:rPr>
+              <w:t>dibandingkan</w:t>
+            </w:r>
+            <w:proofErr w:type="spellEnd"/>
+            <w:r>
+              <w:rPr>
+                <w:rFonts w:asciiTheme="minorHAnsi" w:hAnsiTheme="minorHAnsi" w:cstheme="minorHAnsi"/>
+                <w:sz w:val="24"/>
+                <w:szCs w:val="24"/>
+              </w:rPr>
+              <w:t xml:space="preserve"> </w:t>
+            </w:r>
+            <w:proofErr w:type="spellStart"/>
+            <w:r>
+              <w:rPr>
+                <w:rFonts w:asciiTheme="minorHAnsi" w:hAnsiTheme="minorHAnsi" w:cstheme="minorHAnsi"/>
+                <w:sz w:val="24"/>
+                <w:szCs w:val="24"/>
+              </w:rPr>
+              <w:t>ulang</w:t>
+            </w:r>
+            <w:proofErr w:type="spellEnd"/>
+            <w:r>
+              <w:rPr>
+                <w:rFonts w:asciiTheme="minorHAnsi" w:hAnsiTheme="minorHAnsi" w:cstheme="minorHAnsi"/>
+                <w:sz w:val="24"/>
+                <w:szCs w:val="24"/>
+              </w:rPr>
+              <w:t xml:space="preserve"> </w:t>
+            </w:r>
+            <w:proofErr w:type="spellStart"/>
+            <w:r>
+              <w:rPr>
+                <w:rFonts w:asciiTheme="minorHAnsi" w:hAnsiTheme="minorHAnsi" w:cstheme="minorHAnsi"/>
+                <w:sz w:val="24"/>
+                <w:szCs w:val="24"/>
+              </w:rPr>
+              <w:t>tiap</w:t>
+            </w:r>
+            <w:proofErr w:type="spellEnd"/>
+            <w:r>
+              <w:rPr>
+                <w:rFonts w:asciiTheme="minorHAnsi" w:hAnsiTheme="minorHAnsi" w:cstheme="minorHAnsi"/>
+                <w:sz w:val="24"/>
+                <w:szCs w:val="24"/>
+              </w:rPr>
+              <w:t xml:space="preserve"> </w:t>
+            </w:r>
+            <w:proofErr w:type="spellStart"/>
+            <w:r>
+              <w:rPr>
+                <w:rFonts w:asciiTheme="minorHAnsi" w:hAnsiTheme="minorHAnsi" w:cstheme="minorHAnsi"/>
+                <w:sz w:val="24"/>
+                <w:szCs w:val="24"/>
+              </w:rPr>
+              <w:t>verifikasi</w:t>
+            </w:r>
+            <w:proofErr w:type="spellEnd"/>
+          </w:p>
+        </w:tc>
+        <w:tc>
+          <w:tcPr>
+            <w:tcW w:w="0" w:type="auto"/>
+            <w:shd w:val="clear" w:color="auto" w:fill="FFFFFF" w:themeFill="background1"/>
+            <w:tcMar>
+              <w:top w:w="30" w:type="dxa"/>
+              <w:left w:w="30" w:type="dxa"/>
+              <w:bottom w:w="30" w:type="dxa"/>
+              <w:right w:w="30" w:type="dxa"/>
+            </w:tcMar>
+            <w:hideMark/>
+          </w:tcPr>
+          <w:p>
+            <w:pPr>
+              <w:spacing w:after="90"/>
+              <w:rPr>
+                <w:rFonts w:asciiTheme="minorHAnsi" w:hAnsiTheme="minorHAnsi" w:cstheme="minorHAnsi"/>
+                <w:sz w:val="24"/>
+                <w:szCs w:val="24"/>
+              </w:rPr>
+            </w:pPr>
+            <w:r>
+              <w:rPr>
+                <w:rFonts w:asciiTheme="minorHAnsi" w:hAnsiTheme="minorHAnsi" w:cstheme="minorHAnsi"/>
+                <w:b/>
+                <w:bCs/>
+                <w:sz w:val="24"/>
+                <w:szCs w:val="24"/>
+              </w:rPr>
+              <w:t xml:space="preserve">Tidak </w:t>
+            </w:r>
+            <w:proofErr w:type="spellStart"/>
+            <w:r>
+              <w:rPr>
+                <w:rFonts w:asciiTheme="minorHAnsi" w:hAnsiTheme="minorHAnsi" w:cstheme="minorHAnsi"/>
+                <w:b/>
+                <w:bCs/>
+                <w:sz w:val="24"/>
+                <w:szCs w:val="24"/>
+              </w:rPr>
+              <w:t>ada</w:t>
+            </w:r>
+            <w:proofErr w:type="spellEnd"/>
+            <w:r>
+              <w:rPr>
+                <w:rFonts w:asciiTheme="minorHAnsi" w:hAnsiTheme="minorHAnsi" w:cstheme="minorHAnsi"/>
+                <w:b/>
+                <w:bCs/>
+                <w:sz w:val="24"/>
+                <w:szCs w:val="24"/>
+              </w:rPr>
+              <w:t xml:space="preserve"> </w:t>
+            </w:r>
+            <w:proofErr w:type="spellStart"/>
+            <w:r>
+              <w:rPr>
+                <w:rFonts w:asciiTheme="minorHAnsi" w:hAnsiTheme="minorHAnsi" w:cstheme="minorHAnsi"/>
+                <w:b/>
+                <w:bCs/>
+                <w:sz w:val="24"/>
+                <w:szCs w:val="24"/>
+              </w:rPr>
+              <w:t>sama</w:t>
+            </w:r>
+            <w:proofErr w:type="spellEnd"/>
+            <w:r>
+              <w:rPr>
+                <w:rFonts w:asciiTheme="minorHAnsi" w:hAnsiTheme="minorHAnsi" w:cstheme="minorHAnsi"/>
+                <w:b/>
+                <w:bCs/>
+                <w:sz w:val="24"/>
+                <w:szCs w:val="24"/>
+              </w:rPr>
+              <w:t xml:space="preserve"> </w:t>
+            </w:r>
+            <w:proofErr w:type="spellStart"/>
+            <w:r>
+              <w:rPr>
+                <w:rFonts w:asciiTheme="minorHAnsi" w:hAnsiTheme="minorHAnsi" w:cstheme="minorHAnsi"/>
+                <w:b/>
+                <w:bCs/>
+                <w:sz w:val="24"/>
+                <w:szCs w:val="24"/>
+              </w:rPr>
+              <w:t>sekali</w:t>
+            </w:r>
+            <w:proofErr w:type="spellEnd"/>
+            <w:r>
+              <w:rPr>
+                <w:rFonts w:asciiTheme="minorHAnsi" w:hAnsiTheme="minorHAnsi" w:cstheme="minorHAnsi"/>
+                <w:sz w:val="24"/>
+                <w:szCs w:val="24"/>
+              </w:rPr>
+              <w:t xml:space="preserve"> — </w:t>
+            </w:r>
+            <w:proofErr w:type="spellStart"/>
+            <w:r>
+              <w:rPr>
+                <w:rFonts w:asciiTheme="minorHAnsi" w:hAnsiTheme="minorHAnsi" w:cstheme="minorHAnsi"/>
+                <w:sz w:val="24"/>
+                <w:szCs w:val="24"/>
+              </w:rPr>
+              <w:t>tabel</w:t>
+            </w:r>
+            <w:proofErr w:type="spellEnd"/>
+            <w:r>
+              <w:rPr>
+                <w:rFonts w:asciiTheme="minorHAnsi" w:hAnsiTheme="minorHAnsi" w:cstheme="minorHAnsi"/>
+                <w:sz w:val="24"/>
+                <w:szCs w:val="24"/>
+              </w:rPr>
+              <w:t> </w:t>
+            </w:r>
+            <w:proofErr w:type="spellStart"/>
+            <w:r>
+              <w:rPr>
+                <w:rFonts w:asciiTheme="minorHAnsi" w:hAnsiTheme="minorHAnsi" w:cstheme="minorHAnsi"/>
+                <w:sz w:val="24"/>
+                <w:szCs w:val="24"/>
+              </w:rPr>
+              <w:t>ttd</w:t>
+            </w:r>
+            <w:proofErr w:type="spellEnd"/>
+            <w:r>
+              <w:rPr>
+                <w:rFonts w:asciiTheme="minorHAnsi" w:hAnsiTheme="minorHAnsi" w:cstheme="minorHAnsi"/>
+                <w:sz w:val="24"/>
+                <w:szCs w:val="24"/>
+              </w:rPr>
+              <w:t> </w:t>
+            </w:r>
+            <w:proofErr w:type="spellStart"/>
+            <w:r>
+              <w:rPr>
+                <w:rFonts w:asciiTheme="minorHAnsi" w:hAnsiTheme="minorHAnsi" w:cstheme="minorHAnsi"/>
+                <w:sz w:val="24"/>
+                <w:szCs w:val="24"/>
+              </w:rPr>
+              <w:t>tidak</w:t>
+            </w:r>
+            <w:proofErr w:type="spellEnd"/>
+            <w:r>
+              <w:rPr>
+                <w:rFonts w:asciiTheme="minorHAnsi" w:hAnsiTheme="minorHAnsi" w:cstheme="minorHAnsi"/>
+                <w:sz w:val="24"/>
+                <w:szCs w:val="24"/>
+              </w:rPr>
+              <w:t xml:space="preserve"> punya </w:t>
+            </w:r>
+            <w:proofErr w:type="spellStart"/>
+            <w:r>
+              <w:rPr>
+                <w:rFonts w:asciiTheme="minorHAnsi" w:hAnsiTheme="minorHAnsi" w:cstheme="minorHAnsi"/>
+                <w:sz w:val="24"/>
+                <w:szCs w:val="24"/>
+              </w:rPr>
+              <w:t>kolom</w:t>
+            </w:r>
+            <w:proofErr w:type="spellEnd"/>
+            <w:r>
+              <w:rPr>
+                <w:rFonts w:asciiTheme="minorHAnsi" w:hAnsiTheme="minorHAnsi" w:cstheme="minorHAnsi"/>
+                <w:sz w:val="24"/>
+                <w:szCs w:val="24"/>
+              </w:rPr>
+              <w:t xml:space="preserve"> hash. Halaman </w:t>
+            </w:r>
+            <w:proofErr w:type="spellStart"/>
+            <w:r>
+              <w:rPr>
+                <w:rFonts w:asciiTheme="minorHAnsi" w:hAnsiTheme="minorHAnsi" w:cstheme="minorHAnsi"/>
+                <w:sz w:val="24"/>
+                <w:szCs w:val="24"/>
+              </w:rPr>
+              <w:t>verifikasi</w:t>
+            </w:r>
+            <w:proofErr w:type="spellEnd"/>
+            <w:r>
+              <w:rPr>
+                <w:rFonts w:asciiTheme="minorHAnsi" w:hAnsiTheme="minorHAnsi" w:cstheme="minorHAnsi"/>
+                <w:sz w:val="24"/>
+                <w:szCs w:val="24"/>
+              </w:rPr>
+              <w:t xml:space="preserve"> </w:t>
+            </w:r>
+            <w:proofErr w:type="spellStart"/>
+            <w:r>
+              <w:rPr>
+                <w:rFonts w:asciiTheme="minorHAnsi" w:hAnsiTheme="minorHAnsi" w:cstheme="minorHAnsi"/>
+                <w:sz w:val="24"/>
+                <w:szCs w:val="24"/>
+              </w:rPr>
+              <w:t>cuma</w:t>
+            </w:r>
+            <w:proofErr w:type="spellEnd"/>
+            <w:r>
+              <w:rPr>
+                <w:rFonts w:asciiTheme="minorHAnsi" w:hAnsiTheme="minorHAnsi" w:cstheme="minorHAnsi"/>
+                <w:sz w:val="24"/>
+                <w:szCs w:val="24"/>
+              </w:rPr>
+              <w:t xml:space="preserve"> JOIN </w:t>
+            </w:r>
+            <w:proofErr w:type="spellStart"/>
+            <w:r>
+              <w:rPr>
+                <w:rFonts w:asciiTheme="minorHAnsi" w:hAnsiTheme="minorHAnsi" w:cstheme="minorHAnsi"/>
+                <w:sz w:val="24"/>
+                <w:szCs w:val="24"/>
+              </w:rPr>
+              <w:t>ke</w:t>
+            </w:r>
+            <w:proofErr w:type="spellEnd"/>
+            <w:r>
+              <w:rPr>
+                <w:rFonts w:asciiTheme="minorHAnsi" w:hAnsiTheme="minorHAnsi" w:cstheme="minorHAnsi"/>
+                <w:sz w:val="24"/>
+                <w:szCs w:val="24"/>
+              </w:rPr>
+              <w:t> </w:t>
+            </w:r>
+            <w:proofErr w:type="spellStart"/>
+            <w:r>
+              <w:rPr>
+                <w:rFonts w:asciiTheme="minorHAnsi" w:hAnsiTheme="minorHAnsi" w:cstheme="minorHAnsi"/>
+                <w:sz w:val="24"/>
+                <w:szCs w:val="24"/>
+              </w:rPr>
+              <w:t>permohonan</w:t>
+            </w:r>
+            <w:proofErr w:type="spellEnd"/>
+            <w:r>
+              <w:rPr>
+                <w:rFonts w:asciiTheme="minorHAnsi" w:hAnsiTheme="minorHAnsi" w:cstheme="minorHAnsi"/>
+                <w:sz w:val="24"/>
+                <w:szCs w:val="24"/>
+              </w:rPr>
+              <w:t xml:space="preserve"> dan </w:t>
+            </w:r>
+            <w:proofErr w:type="spellStart"/>
+            <w:r>
+              <w:rPr>
+                <w:rFonts w:asciiTheme="minorHAnsi" w:hAnsiTheme="minorHAnsi" w:cstheme="minorHAnsi"/>
+                <w:sz w:val="24"/>
+                <w:szCs w:val="24"/>
+              </w:rPr>
+              <w:t>tampilkan</w:t>
+            </w:r>
+            <w:proofErr w:type="spellEnd"/>
+            <w:r>
+              <w:rPr>
+                <w:rFonts w:asciiTheme="minorHAnsi" w:hAnsiTheme="minorHAnsi" w:cstheme="minorHAnsi"/>
+                <w:sz w:val="24"/>
+                <w:szCs w:val="24"/>
+              </w:rPr>
+              <w:t xml:space="preserve"> data </w:t>
+            </w:r>
+            <w:proofErr w:type="spellStart"/>
+            <w:r>
+              <w:rPr>
+                <w:rFonts w:asciiTheme="minorHAnsi" w:hAnsiTheme="minorHAnsi" w:cstheme="minorHAnsi"/>
+                <w:b/>
+                <w:bCs/>
+                <w:sz w:val="24"/>
+                <w:szCs w:val="24"/>
+              </w:rPr>
+              <w:t>saat</w:t>
+            </w:r>
+            <w:proofErr w:type="spellEnd"/>
+            <w:r>
+              <w:rPr>
+                <w:rFonts w:asciiTheme="minorHAnsi" w:hAnsiTheme="minorHAnsi" w:cstheme="minorHAnsi"/>
+                <w:b/>
+                <w:bCs/>
+                <w:sz w:val="24"/>
+                <w:szCs w:val="24"/>
+              </w:rPr>
+              <w:t xml:space="preserve"> </w:t>
+            </w:r>
+            <w:proofErr w:type="spellStart"/>
+            <w:r>
+              <w:rPr>
+                <w:rFonts w:asciiTheme="minorHAnsi" w:hAnsiTheme="minorHAnsi" w:cstheme="minorHAnsi"/>
+                <w:b/>
+                <w:bCs/>
+                <w:sz w:val="24"/>
+                <w:szCs w:val="24"/>
+              </w:rPr>
+              <w:t>ini</w:t>
+            </w:r>
+            <w:proofErr w:type="spellEnd"/>
+            <w:r>
+              <w:rPr>
+                <w:rFonts w:asciiTheme="minorHAnsi" w:hAnsiTheme="minorHAnsi" w:cstheme="minorHAnsi"/>
+                <w:sz w:val="24"/>
+                <w:szCs w:val="24"/>
+              </w:rPr>
+              <w:t xml:space="preserve">, </w:t>
+            </w:r>
+            <w:proofErr w:type="spellStart"/>
+            <w:r>
+              <w:rPr>
+                <w:rFonts w:asciiTheme="minorHAnsi" w:hAnsiTheme="minorHAnsi" w:cstheme="minorHAnsi"/>
+                <w:sz w:val="24"/>
+                <w:szCs w:val="24"/>
+              </w:rPr>
+              <w:t>jadi</w:t>
+            </w:r>
+            <w:proofErr w:type="spellEnd"/>
+            <w:r>
+              <w:rPr>
+                <w:rFonts w:asciiTheme="minorHAnsi" w:hAnsiTheme="minorHAnsi" w:cstheme="minorHAnsi"/>
+                <w:sz w:val="24"/>
+                <w:szCs w:val="24"/>
+              </w:rPr>
+              <w:t xml:space="preserve"> </w:t>
+            </w:r>
+            <w:proofErr w:type="spellStart"/>
+            <w:r>
+              <w:rPr>
+                <w:rFonts w:asciiTheme="minorHAnsi" w:hAnsiTheme="minorHAnsi" w:cstheme="minorHAnsi"/>
+                <w:sz w:val="24"/>
+                <w:szCs w:val="24"/>
+              </w:rPr>
+              <w:t>kalau</w:t>
+            </w:r>
+            <w:proofErr w:type="spellEnd"/>
+            <w:r>
+              <w:rPr>
+                <w:rFonts w:asciiTheme="minorHAnsi" w:hAnsiTheme="minorHAnsi" w:cstheme="minorHAnsi"/>
+                <w:sz w:val="24"/>
+                <w:szCs w:val="24"/>
+              </w:rPr>
+              <w:t xml:space="preserve"> </w:t>
+            </w:r>
+            <w:proofErr w:type="spellStart"/>
+            <w:r>
+              <w:rPr>
+                <w:rFonts w:asciiTheme="minorHAnsi" w:hAnsiTheme="minorHAnsi" w:cstheme="minorHAnsi"/>
+                <w:sz w:val="24"/>
+                <w:szCs w:val="24"/>
+              </w:rPr>
+              <w:t>isi</w:t>
+            </w:r>
+            <w:proofErr w:type="spellEnd"/>
+            <w:r>
+              <w:rPr>
+                <w:rFonts w:asciiTheme="minorHAnsi" w:hAnsiTheme="minorHAnsi" w:cstheme="minorHAnsi"/>
+                <w:sz w:val="24"/>
+                <w:szCs w:val="24"/>
+              </w:rPr>
+              <w:t xml:space="preserve"> </w:t>
+            </w:r>
+            <w:proofErr w:type="spellStart"/>
+            <w:r>
+              <w:rPr>
+                <w:rFonts w:asciiTheme="minorHAnsi" w:hAnsiTheme="minorHAnsi" w:cstheme="minorHAnsi"/>
+                <w:sz w:val="24"/>
+                <w:szCs w:val="24"/>
+              </w:rPr>
+              <w:t>permohonan</w:t>
+            </w:r>
+            <w:proofErr w:type="spellEnd"/>
+            <w:r>
+              <w:rPr>
+                <w:rFonts w:asciiTheme="minorHAnsi" w:hAnsiTheme="minorHAnsi" w:cstheme="minorHAnsi"/>
+                <w:sz w:val="24"/>
+                <w:szCs w:val="24"/>
+              </w:rPr>
+              <w:t xml:space="preserve"> </w:t>
+            </w:r>
+            <w:proofErr w:type="spellStart"/>
+            <w:r>
+              <w:rPr>
+                <w:rFonts w:asciiTheme="minorHAnsi" w:hAnsiTheme="minorHAnsi" w:cstheme="minorHAnsi"/>
+                <w:sz w:val="24"/>
+                <w:szCs w:val="24"/>
+              </w:rPr>
+              <w:t>diedit</w:t>
+            </w:r>
+            <w:proofErr w:type="spellEnd"/>
+            <w:r>
+              <w:rPr>
+                <w:rFonts w:asciiTheme="minorHAnsi" w:hAnsiTheme="minorHAnsi" w:cstheme="minorHAnsi"/>
+                <w:sz w:val="24"/>
+                <w:szCs w:val="24"/>
+              </w:rPr>
+              <w:t xml:space="preserve"> </w:t>
+            </w:r>
+            <w:proofErr w:type="spellStart"/>
+            <w:r>
+              <w:rPr>
+                <w:rFonts w:asciiTheme="minorHAnsi" w:hAnsiTheme="minorHAnsi" w:cstheme="minorHAnsi"/>
+                <w:sz w:val="24"/>
+                <w:szCs w:val="24"/>
+              </w:rPr>
+              <w:t>setelah</w:t>
+            </w:r>
+            <w:proofErr w:type="spellEnd"/>
+            <w:r>
+              <w:rPr>
+                <w:rFonts w:asciiTheme="minorHAnsi" w:hAnsiTheme="minorHAnsi" w:cstheme="minorHAnsi"/>
+                <w:sz w:val="24"/>
+                <w:szCs w:val="24"/>
+              </w:rPr>
+              <w:t xml:space="preserve"> TTD, </w:t>
+            </w:r>
+            <w:proofErr w:type="spellStart"/>
+            <w:r>
+              <w:rPr>
+                <w:rFonts w:asciiTheme="minorHAnsi" w:hAnsiTheme="minorHAnsi" w:cstheme="minorHAnsi"/>
+                <w:sz w:val="24"/>
+                <w:szCs w:val="24"/>
+              </w:rPr>
+              <w:t>verifikasi</w:t>
+            </w:r>
+            <w:proofErr w:type="spellEnd"/>
+            <w:r>
+              <w:rPr>
+                <w:rFonts w:asciiTheme="minorHAnsi" w:hAnsiTheme="minorHAnsi" w:cstheme="minorHAnsi"/>
+                <w:sz w:val="24"/>
+                <w:szCs w:val="24"/>
+              </w:rPr>
+              <w:t xml:space="preserve"> </w:t>
+            </w:r>
+            <w:proofErr w:type="spellStart"/>
+            <w:r>
+              <w:rPr>
+                <w:rFonts w:asciiTheme="minorHAnsi" w:hAnsiTheme="minorHAnsi" w:cstheme="minorHAnsi"/>
+                <w:sz w:val="24"/>
+                <w:szCs w:val="24"/>
+              </w:rPr>
+              <w:t>tetap</w:t>
+            </w:r>
+            <w:proofErr w:type="spellEnd"/>
+            <w:r>
+              <w:rPr>
+                <w:rFonts w:asciiTheme="minorHAnsi" w:hAnsiTheme="minorHAnsi" w:cstheme="minorHAnsi"/>
+                <w:sz w:val="24"/>
+                <w:szCs w:val="24"/>
+              </w:rPr>
+              <w:t xml:space="preserve"> </w:t>
+            </w:r>
+            <w:proofErr w:type="spellStart"/>
+            <w:r>
+              <w:rPr>
+                <w:rFonts w:asciiTheme="minorHAnsi" w:hAnsiTheme="minorHAnsi" w:cstheme="minorHAnsi"/>
+                <w:sz w:val="24"/>
+                <w:szCs w:val="24"/>
+              </w:rPr>
+              <w:t>bilang</w:t>
+            </w:r>
+            <w:proofErr w:type="spellEnd"/>
+            <w:r>
+              <w:rPr>
+                <w:rFonts w:asciiTheme="minorHAnsi" w:hAnsiTheme="minorHAnsi" w:cstheme="minorHAnsi"/>
+                <w:sz w:val="24"/>
+                <w:szCs w:val="24"/>
+              </w:rPr>
+              <w:t xml:space="preserve"> "Sah" </w:t>
+            </w:r>
+            <w:proofErr w:type="spellStart"/>
+            <w:r>
+              <w:rPr>
+                <w:rFonts w:asciiTheme="minorHAnsi" w:hAnsiTheme="minorHAnsi" w:cstheme="minorHAnsi"/>
+                <w:sz w:val="24"/>
+                <w:szCs w:val="24"/>
+              </w:rPr>
+              <w:t>tanpa</w:t>
+            </w:r>
+            <w:proofErr w:type="spellEnd"/>
+            <w:r>
+              <w:rPr>
+                <w:rFonts w:asciiTheme="minorHAnsi" w:hAnsiTheme="minorHAnsi" w:cstheme="minorHAnsi"/>
+                <w:sz w:val="24"/>
+                <w:szCs w:val="24"/>
+              </w:rPr>
+              <w:t xml:space="preserve"> </w:t>
+            </w:r>
+            <w:proofErr w:type="spellStart"/>
+            <w:r>
+              <w:rPr>
+                <w:rFonts w:asciiTheme="minorHAnsi" w:hAnsiTheme="minorHAnsi" w:cstheme="minorHAnsi"/>
+                <w:sz w:val="24"/>
+                <w:szCs w:val="24"/>
+              </w:rPr>
+              <w:t>tahu</w:t>
+            </w:r>
+            <w:proofErr w:type="spellEnd"/>
+            <w:r>
+              <w:rPr>
+                <w:rFonts w:asciiTheme="minorHAnsi" w:hAnsiTheme="minorHAnsi" w:cstheme="minorHAnsi"/>
+                <w:sz w:val="24"/>
+                <w:szCs w:val="24"/>
+              </w:rPr>
+              <w:t xml:space="preserve"> </w:t>
+            </w:r>
+            <w:proofErr w:type="spellStart"/>
+            <w:r>
+              <w:rPr>
+                <w:rFonts w:asciiTheme="minorHAnsi" w:hAnsiTheme="minorHAnsi" w:cstheme="minorHAnsi"/>
+                <w:sz w:val="24"/>
+                <w:szCs w:val="24"/>
+              </w:rPr>
+              <w:t>datanya</w:t>
+            </w:r>
+            <w:proofErr w:type="spellEnd"/>
+            <w:r>
+              <w:rPr>
+                <w:rFonts w:asciiTheme="minorHAnsi" w:hAnsiTheme="minorHAnsi" w:cstheme="minorHAnsi"/>
+                <w:sz w:val="24"/>
+                <w:szCs w:val="24"/>
+              </w:rPr>
+              <w:t xml:space="preserve"> </w:t>
+            </w:r>
+            <w:proofErr w:type="spellStart"/>
+            <w:r>
+              <w:rPr>
+                <w:rFonts w:asciiTheme="minorHAnsi" w:hAnsiTheme="minorHAnsi" w:cstheme="minorHAnsi"/>
+                <w:sz w:val="24"/>
+                <w:szCs w:val="24"/>
+              </w:rPr>
+              <w:t>sudah</w:t>
+            </w:r>
+            <w:proofErr w:type="spellEnd"/>
+            <w:r>
+              <w:rPr>
+                <w:rFonts w:asciiTheme="minorHAnsi" w:hAnsiTheme="minorHAnsi" w:cstheme="minorHAnsi"/>
+                <w:sz w:val="24"/>
+                <w:szCs w:val="24"/>
+              </w:rPr>
+              <w:t xml:space="preserve"> </w:t>
+            </w:r>
+            <w:proofErr w:type="spellStart"/>
+            <w:r>
+              <w:rPr>
+                <w:rFonts w:asciiTheme="minorHAnsi" w:hAnsiTheme="minorHAnsi" w:cstheme="minorHAnsi"/>
+                <w:sz w:val="24"/>
+                <w:szCs w:val="24"/>
+              </w:rPr>
+              <w:t>berubah</w:t>
+            </w:r>
+            <w:proofErr w:type="spellEnd"/>
+          </w:p>
+        </w:tc>
+      </w:tr>
+      <w:tr>
+        <w:tc>
+          <w:tcPr>
+            <w:tcW w:w="1154" w:type="dxa"/>
+            <w:shd w:val="clear" w:color="auto" w:fill="FFFFFF" w:themeFill="background1"/>
+            <w:tcMar>
+              <w:top w:w="30" w:type="dxa"/>
+              <w:left w:w="30" w:type="dxa"/>
+              <w:bottom w:w="30" w:type="dxa"/>
+              <w:right w:w="30" w:type="dxa"/>
+            </w:tcMar>
+            <w:hideMark/>
+          </w:tcPr>
+          <w:p>
+            <w:pPr>
+              <w:spacing w:after="90"/>
+              <w:rPr>
+                <w:rFonts w:asciiTheme="minorHAnsi" w:hAnsiTheme="minorHAnsi" w:cstheme="minorHAnsi"/>
+                <w:sz w:val="24"/>
+                <w:szCs w:val="24"/>
+              </w:rPr>
+            </w:pPr>
+            <w:proofErr w:type="spellStart"/>
+            <w:r>
+              <w:rPr>
+                <w:rFonts w:asciiTheme="minorHAnsi" w:hAnsiTheme="minorHAnsi" w:cstheme="minorHAnsi"/>
+                <w:b/>
+                <w:bCs/>
+                <w:sz w:val="24"/>
+                <w:szCs w:val="24"/>
+              </w:rPr>
+              <w:t>Kunci</w:t>
+            </w:r>
+            <w:proofErr w:type="spellEnd"/>
+            <w:r>
+              <w:rPr>
+                <w:rFonts w:asciiTheme="minorHAnsi" w:hAnsiTheme="minorHAnsi" w:cstheme="minorHAnsi"/>
+                <w:b/>
+                <w:bCs/>
+                <w:sz w:val="24"/>
+                <w:szCs w:val="24"/>
+              </w:rPr>
+              <w:t xml:space="preserve"> </w:t>
+            </w:r>
+            <w:proofErr w:type="spellStart"/>
+            <w:r>
+              <w:rPr>
+                <w:rFonts w:asciiTheme="minorHAnsi" w:hAnsiTheme="minorHAnsi" w:cstheme="minorHAnsi"/>
+                <w:b/>
+                <w:bCs/>
+                <w:sz w:val="24"/>
+                <w:szCs w:val="24"/>
+              </w:rPr>
+              <w:t>dokumen</w:t>
+            </w:r>
+            <w:proofErr w:type="spellEnd"/>
+            <w:r>
+              <w:rPr>
+                <w:rFonts w:asciiTheme="minorHAnsi" w:hAnsiTheme="minorHAnsi" w:cstheme="minorHAnsi"/>
+                <w:b/>
+                <w:bCs/>
+                <w:sz w:val="24"/>
+                <w:szCs w:val="24"/>
+              </w:rPr>
+              <w:t xml:space="preserve"> </w:t>
+            </w:r>
+            <w:proofErr w:type="spellStart"/>
+            <w:r>
+              <w:rPr>
+                <w:rFonts w:asciiTheme="minorHAnsi" w:hAnsiTheme="minorHAnsi" w:cstheme="minorHAnsi"/>
+                <w:b/>
+                <w:bCs/>
+                <w:sz w:val="24"/>
+                <w:szCs w:val="24"/>
+              </w:rPr>
+              <w:t>setelah</w:t>
+            </w:r>
+            <w:proofErr w:type="spellEnd"/>
+            <w:r>
+              <w:rPr>
+                <w:rFonts w:asciiTheme="minorHAnsi" w:hAnsiTheme="minorHAnsi" w:cstheme="minorHAnsi"/>
+                <w:b/>
+                <w:bCs/>
+                <w:sz w:val="24"/>
+                <w:szCs w:val="24"/>
+              </w:rPr>
+              <w:t xml:space="preserve"> TTD</w:t>
+            </w:r>
+          </w:p>
+        </w:tc>
+        <w:tc>
+          <w:tcPr>
+            <w:tcW w:w="3563" w:type="dxa"/>
+            <w:shd w:val="clear" w:color="auto" w:fill="FFFFFF" w:themeFill="background1"/>
+            <w:tcMar>
+              <w:top w:w="30" w:type="dxa"/>
+              <w:left w:w="30" w:type="dxa"/>
+              <w:bottom w:w="30" w:type="dxa"/>
+              <w:right w:w="30" w:type="dxa"/>
+            </w:tcMar>
+            <w:hideMark/>
+          </w:tcPr>
+          <w:p>
+            <w:pPr>
+              <w:spacing w:after="90"/>
+              <w:rPr>
+                <w:rFonts w:asciiTheme="minorHAnsi" w:hAnsiTheme="minorHAnsi" w:cstheme="minorHAnsi"/>
+                <w:sz w:val="24"/>
+                <w:szCs w:val="24"/>
+              </w:rPr>
+            </w:pPr>
+            <w:r>
+              <w:rPr>
+                <w:rFonts w:asciiTheme="minorHAnsi" w:hAnsiTheme="minorHAnsi" w:cstheme="minorHAnsi"/>
+                <w:sz w:val="24"/>
+                <w:szCs w:val="24"/>
+              </w:rPr>
+              <w:t>Ada (</w:t>
+            </w:r>
+            <w:proofErr w:type="spellStart"/>
+            <w:r>
+              <w:rPr>
+                <w:rFonts w:asciiTheme="minorHAnsi" w:hAnsiTheme="minorHAnsi" w:cstheme="minorHAnsi"/>
+                <w:sz w:val="24"/>
+                <w:szCs w:val="24"/>
+              </w:rPr>
+              <w:t>baru</w:t>
+            </w:r>
+            <w:proofErr w:type="spellEnd"/>
+            <w:r>
+              <w:rPr>
+                <w:rFonts w:asciiTheme="minorHAnsi" w:hAnsiTheme="minorHAnsi" w:cstheme="minorHAnsi"/>
+                <w:sz w:val="24"/>
+                <w:szCs w:val="24"/>
+              </w:rPr>
+              <w:t xml:space="preserve"> </w:t>
+            </w:r>
+            <w:proofErr w:type="spellStart"/>
+            <w:r>
+              <w:rPr>
+                <w:rFonts w:asciiTheme="minorHAnsi" w:hAnsiTheme="minorHAnsi" w:cstheme="minorHAnsi"/>
+                <w:sz w:val="24"/>
+                <w:szCs w:val="24"/>
+              </w:rPr>
+              <w:t>ditambah</w:t>
+            </w:r>
+            <w:proofErr w:type="spellEnd"/>
+            <w:r>
+              <w:rPr>
+                <w:rFonts w:asciiTheme="minorHAnsi" w:hAnsiTheme="minorHAnsi" w:cstheme="minorHAnsi"/>
+                <w:sz w:val="24"/>
+                <w:szCs w:val="24"/>
+              </w:rPr>
+              <w:t xml:space="preserve">) — SP </w:t>
+            </w:r>
+            <w:proofErr w:type="spellStart"/>
+            <w:r>
+              <w:rPr>
+                <w:rFonts w:asciiTheme="minorHAnsi" w:hAnsiTheme="minorHAnsi" w:cstheme="minorHAnsi"/>
+                <w:sz w:val="24"/>
+                <w:szCs w:val="24"/>
+              </w:rPr>
+              <w:t>tidak</w:t>
+            </w:r>
+            <w:proofErr w:type="spellEnd"/>
+            <w:r>
+              <w:rPr>
+                <w:rFonts w:asciiTheme="minorHAnsi" w:hAnsiTheme="minorHAnsi" w:cstheme="minorHAnsi"/>
+                <w:sz w:val="24"/>
+                <w:szCs w:val="24"/>
+              </w:rPr>
+              <w:t xml:space="preserve"> </w:t>
+            </w:r>
+            <w:proofErr w:type="spellStart"/>
+            <w:r>
+              <w:rPr>
+                <w:rFonts w:asciiTheme="minorHAnsi" w:hAnsiTheme="minorHAnsi" w:cstheme="minorHAnsi"/>
+                <w:sz w:val="24"/>
+                <w:szCs w:val="24"/>
+              </w:rPr>
+              <w:t>bisa</w:t>
+            </w:r>
+            <w:proofErr w:type="spellEnd"/>
+            <w:r>
+              <w:rPr>
+                <w:rFonts w:asciiTheme="minorHAnsi" w:hAnsiTheme="minorHAnsi" w:cstheme="minorHAnsi"/>
+                <w:sz w:val="24"/>
+                <w:szCs w:val="24"/>
+              </w:rPr>
+              <w:t xml:space="preserve"> </w:t>
+            </w:r>
+            <w:proofErr w:type="spellStart"/>
+            <w:r>
+              <w:rPr>
+                <w:rFonts w:asciiTheme="minorHAnsi" w:hAnsiTheme="minorHAnsi" w:cstheme="minorHAnsi"/>
+                <w:sz w:val="24"/>
+                <w:szCs w:val="24"/>
+              </w:rPr>
+              <w:t>diedit</w:t>
+            </w:r>
+            <w:proofErr w:type="spellEnd"/>
+            <w:r>
+              <w:rPr>
+                <w:rFonts w:asciiTheme="minorHAnsi" w:hAnsiTheme="minorHAnsi" w:cstheme="minorHAnsi"/>
+                <w:sz w:val="24"/>
+                <w:szCs w:val="24"/>
+              </w:rPr>
+              <w:t xml:space="preserve"> </w:t>
+            </w:r>
+            <w:proofErr w:type="spellStart"/>
+            <w:r>
+              <w:rPr>
+                <w:rFonts w:asciiTheme="minorHAnsi" w:hAnsiTheme="minorHAnsi" w:cstheme="minorHAnsi"/>
+                <w:sz w:val="24"/>
+                <w:szCs w:val="24"/>
+              </w:rPr>
+              <w:t>lagi</w:t>
+            </w:r>
+            <w:proofErr w:type="spellEnd"/>
+            <w:r>
+              <w:rPr>
+                <w:rFonts w:asciiTheme="minorHAnsi" w:hAnsiTheme="minorHAnsi" w:cstheme="minorHAnsi"/>
+                <w:sz w:val="24"/>
+                <w:szCs w:val="24"/>
+              </w:rPr>
+              <w:t xml:space="preserve"> </w:t>
+            </w:r>
+            <w:proofErr w:type="spellStart"/>
+            <w:r>
+              <w:rPr>
+                <w:rFonts w:asciiTheme="minorHAnsi" w:hAnsiTheme="minorHAnsi" w:cstheme="minorHAnsi"/>
+                <w:sz w:val="24"/>
+                <w:szCs w:val="24"/>
+              </w:rPr>
+              <w:t>begitu</w:t>
+            </w:r>
+            <w:proofErr w:type="spellEnd"/>
+            <w:r>
+              <w:rPr>
+                <w:rFonts w:asciiTheme="minorHAnsi" w:hAnsiTheme="minorHAnsi" w:cstheme="minorHAnsi"/>
+                <w:sz w:val="24"/>
+                <w:szCs w:val="24"/>
+              </w:rPr>
+              <w:t xml:space="preserve"> </w:t>
+            </w:r>
+            <w:proofErr w:type="spellStart"/>
+            <w:r>
+              <w:rPr>
+                <w:rFonts w:asciiTheme="minorHAnsi" w:hAnsiTheme="minorHAnsi" w:cstheme="minorHAnsi"/>
+                <w:sz w:val="24"/>
+                <w:szCs w:val="24"/>
+              </w:rPr>
+              <w:t>semua</w:t>
+            </w:r>
+            <w:proofErr w:type="spellEnd"/>
+            <w:r>
+              <w:rPr>
+                <w:rFonts w:asciiTheme="minorHAnsi" w:hAnsiTheme="minorHAnsi" w:cstheme="minorHAnsi"/>
+                <w:sz w:val="24"/>
+                <w:szCs w:val="24"/>
+              </w:rPr>
+              <w:t xml:space="preserve"> </w:t>
+            </w:r>
+            <w:proofErr w:type="spellStart"/>
+            <w:r>
+              <w:rPr>
+                <w:rFonts w:asciiTheme="minorHAnsi" w:hAnsiTheme="minorHAnsi" w:cstheme="minorHAnsi"/>
+                <w:sz w:val="24"/>
+                <w:szCs w:val="24"/>
+              </w:rPr>
+              <w:t>pihak</w:t>
+            </w:r>
+            <w:proofErr w:type="spellEnd"/>
+            <w:r>
+              <w:rPr>
+                <w:rFonts w:asciiTheme="minorHAnsi" w:hAnsiTheme="minorHAnsi" w:cstheme="minorHAnsi"/>
+                <w:sz w:val="24"/>
+                <w:szCs w:val="24"/>
+              </w:rPr>
+              <w:t xml:space="preserve"> TTD</w:t>
+            </w:r>
+          </w:p>
+        </w:tc>
+        <w:tc>
+          <w:tcPr>
+            <w:tcW w:w="0" w:type="auto"/>
+            <w:shd w:val="clear" w:color="auto" w:fill="FFFFFF" w:themeFill="background1"/>
+            <w:tcMar>
+              <w:top w:w="30" w:type="dxa"/>
+              <w:left w:w="30" w:type="dxa"/>
+              <w:bottom w:w="30" w:type="dxa"/>
+              <w:right w:w="30" w:type="dxa"/>
+            </w:tcMar>
+            <w:hideMark/>
+          </w:tcPr>
+          <w:p>
+            <w:pPr>
+              <w:spacing w:after="90"/>
+              <w:rPr>
+                <w:rFonts w:asciiTheme="minorHAnsi" w:hAnsiTheme="minorHAnsi" w:cstheme="minorHAnsi"/>
+                <w:sz w:val="24"/>
+                <w:szCs w:val="24"/>
+              </w:rPr>
+            </w:pPr>
+            <w:r>
+              <w:rPr>
+                <w:rFonts w:asciiTheme="minorHAnsi" w:hAnsiTheme="minorHAnsi" w:cstheme="minorHAnsi"/>
+                <w:sz w:val="24"/>
+                <w:szCs w:val="24"/>
+              </w:rPr>
+              <w:t xml:space="preserve">Tidak </w:t>
+            </w:r>
+            <w:proofErr w:type="spellStart"/>
+            <w:r>
+              <w:rPr>
+                <w:rFonts w:asciiTheme="minorHAnsi" w:hAnsiTheme="minorHAnsi" w:cstheme="minorHAnsi"/>
+                <w:sz w:val="24"/>
+                <w:szCs w:val="24"/>
+              </w:rPr>
+              <w:t>ditemukan</w:t>
+            </w:r>
+            <w:proofErr w:type="spellEnd"/>
+            <w:r>
+              <w:rPr>
+                <w:rFonts w:asciiTheme="minorHAnsi" w:hAnsiTheme="minorHAnsi" w:cstheme="minorHAnsi"/>
+                <w:sz w:val="24"/>
+                <w:szCs w:val="24"/>
+              </w:rPr>
+              <w:t xml:space="preserve"> </w:t>
+            </w:r>
+            <w:proofErr w:type="spellStart"/>
+            <w:r>
+              <w:rPr>
+                <w:rFonts w:asciiTheme="minorHAnsi" w:hAnsiTheme="minorHAnsi" w:cstheme="minorHAnsi"/>
+                <w:sz w:val="24"/>
+                <w:szCs w:val="24"/>
+              </w:rPr>
+              <w:t>mekanisme</w:t>
+            </w:r>
+            <w:proofErr w:type="spellEnd"/>
+            <w:r>
+              <w:rPr>
+                <w:rFonts w:asciiTheme="minorHAnsi" w:hAnsiTheme="minorHAnsi" w:cstheme="minorHAnsi"/>
+                <w:sz w:val="24"/>
+                <w:szCs w:val="24"/>
+              </w:rPr>
+              <w:t xml:space="preserve"> lock — </w:t>
+            </w:r>
+            <w:proofErr w:type="spellStart"/>
+            <w:r>
+              <w:rPr>
+                <w:rFonts w:asciiTheme="minorHAnsi" w:hAnsiTheme="minorHAnsi" w:cstheme="minorHAnsi"/>
+                <w:sz w:val="24"/>
+                <w:szCs w:val="24"/>
+              </w:rPr>
+              <w:t>permohonan</w:t>
+            </w:r>
+            <w:proofErr w:type="spellEnd"/>
+            <w:r>
+              <w:rPr>
+                <w:rFonts w:asciiTheme="minorHAnsi" w:hAnsiTheme="minorHAnsi" w:cstheme="minorHAnsi"/>
+                <w:sz w:val="24"/>
+                <w:szCs w:val="24"/>
+              </w:rPr>
+              <w:t>/</w:t>
+            </w:r>
+            <w:proofErr w:type="spellStart"/>
+            <w:r>
+              <w:rPr>
+                <w:rFonts w:asciiTheme="minorHAnsi" w:hAnsiTheme="minorHAnsi" w:cstheme="minorHAnsi"/>
+                <w:sz w:val="24"/>
+                <w:szCs w:val="24"/>
+              </w:rPr>
+              <w:t>permohonan_item</w:t>
+            </w:r>
+            <w:proofErr w:type="spellEnd"/>
+            <w:r>
+              <w:rPr>
+                <w:rFonts w:asciiTheme="minorHAnsi" w:hAnsiTheme="minorHAnsi" w:cstheme="minorHAnsi"/>
+                <w:sz w:val="24"/>
+                <w:szCs w:val="24"/>
+              </w:rPr>
+              <w:t> </w:t>
+            </w:r>
+            <w:proofErr w:type="spellStart"/>
+            <w:r>
+              <w:rPr>
+                <w:rFonts w:asciiTheme="minorHAnsi" w:hAnsiTheme="minorHAnsi" w:cstheme="minorHAnsi"/>
+                <w:sz w:val="24"/>
+                <w:szCs w:val="24"/>
+              </w:rPr>
+              <w:t>sepertinya</w:t>
+            </w:r>
+            <w:proofErr w:type="spellEnd"/>
+            <w:r>
+              <w:rPr>
+                <w:rFonts w:asciiTheme="minorHAnsi" w:hAnsiTheme="minorHAnsi" w:cstheme="minorHAnsi"/>
+                <w:sz w:val="24"/>
+                <w:szCs w:val="24"/>
+              </w:rPr>
+              <w:t xml:space="preserve"> </w:t>
+            </w:r>
+            <w:proofErr w:type="spellStart"/>
+            <w:r>
+              <w:rPr>
+                <w:rFonts w:asciiTheme="minorHAnsi" w:hAnsiTheme="minorHAnsi" w:cstheme="minorHAnsi"/>
+                <w:sz w:val="24"/>
+                <w:szCs w:val="24"/>
+              </w:rPr>
+              <w:t>tetap</w:t>
+            </w:r>
+            <w:proofErr w:type="spellEnd"/>
+            <w:r>
+              <w:rPr>
+                <w:rFonts w:asciiTheme="minorHAnsi" w:hAnsiTheme="minorHAnsi" w:cstheme="minorHAnsi"/>
+                <w:sz w:val="24"/>
+                <w:szCs w:val="24"/>
+              </w:rPr>
+              <w:t xml:space="preserve"> </w:t>
+            </w:r>
+            <w:proofErr w:type="spellStart"/>
+            <w:r>
+              <w:rPr>
+                <w:rFonts w:asciiTheme="minorHAnsi" w:hAnsiTheme="minorHAnsi" w:cstheme="minorHAnsi"/>
+                <w:sz w:val="24"/>
+                <w:szCs w:val="24"/>
+              </w:rPr>
+              <w:t>bisa</w:t>
+            </w:r>
+            <w:proofErr w:type="spellEnd"/>
+            <w:r>
+              <w:rPr>
+                <w:rFonts w:asciiTheme="minorHAnsi" w:hAnsiTheme="minorHAnsi" w:cstheme="minorHAnsi"/>
+                <w:sz w:val="24"/>
+                <w:szCs w:val="24"/>
+              </w:rPr>
+              <w:t xml:space="preserve"> </w:t>
+            </w:r>
+            <w:proofErr w:type="spellStart"/>
+            <w:r>
+              <w:rPr>
+                <w:rFonts w:asciiTheme="minorHAnsi" w:hAnsiTheme="minorHAnsi" w:cstheme="minorHAnsi"/>
+                <w:sz w:val="24"/>
+                <w:szCs w:val="24"/>
+              </w:rPr>
+              <w:t>berubah</w:t>
+            </w:r>
+            <w:proofErr w:type="spellEnd"/>
+            <w:r>
+              <w:rPr>
+                <w:rFonts w:asciiTheme="minorHAnsi" w:hAnsiTheme="minorHAnsi" w:cstheme="minorHAnsi"/>
+                <w:sz w:val="24"/>
+                <w:szCs w:val="24"/>
+              </w:rPr>
+              <w:t xml:space="preserve"> status/</w:t>
+            </w:r>
+            <w:proofErr w:type="spellStart"/>
+            <w:r>
+              <w:rPr>
+                <w:rFonts w:asciiTheme="minorHAnsi" w:hAnsiTheme="minorHAnsi" w:cstheme="minorHAnsi"/>
+                <w:sz w:val="24"/>
+                <w:szCs w:val="24"/>
+              </w:rPr>
+              <w:t>catatan</w:t>
+            </w:r>
+            <w:proofErr w:type="spellEnd"/>
+            <w:r>
+              <w:rPr>
+                <w:rFonts w:asciiTheme="minorHAnsi" w:hAnsiTheme="minorHAnsi" w:cstheme="minorHAnsi"/>
+                <w:sz w:val="24"/>
+                <w:szCs w:val="24"/>
+              </w:rPr>
+              <w:t xml:space="preserve"> </w:t>
+            </w:r>
+            <w:proofErr w:type="spellStart"/>
+            <w:r>
+              <w:rPr>
+                <w:rFonts w:asciiTheme="minorHAnsi" w:hAnsiTheme="minorHAnsi" w:cstheme="minorHAnsi"/>
+                <w:sz w:val="24"/>
+                <w:szCs w:val="24"/>
+              </w:rPr>
+              <w:t>setelah</w:t>
+            </w:r>
+            <w:proofErr w:type="spellEnd"/>
+            <w:r>
+              <w:rPr>
+                <w:rFonts w:asciiTheme="minorHAnsi" w:hAnsiTheme="minorHAnsi" w:cstheme="minorHAnsi"/>
+                <w:sz w:val="24"/>
+                <w:szCs w:val="24"/>
+              </w:rPr>
+              <w:t xml:space="preserve"> TTD </w:t>
+            </w:r>
+            <w:proofErr w:type="spellStart"/>
+            <w:r>
+              <w:rPr>
+                <w:rFonts w:asciiTheme="minorHAnsi" w:hAnsiTheme="minorHAnsi" w:cstheme="minorHAnsi"/>
+                <w:sz w:val="24"/>
+                <w:szCs w:val="24"/>
+              </w:rPr>
+              <w:t>dibubuhkan</w:t>
+            </w:r>
+            <w:proofErr w:type="spellEnd"/>
+          </w:p>
+        </w:tc>
+      </w:tr>
+      <w:tr>
+        <w:tc>
+          <w:tcPr>
+            <w:tcW w:w="1154" w:type="dxa"/>
+            <w:shd w:val="clear" w:color="auto" w:fill="FFFFFF" w:themeFill="background1"/>
+            <w:tcMar>
+              <w:top w:w="30" w:type="dxa"/>
+              <w:left w:w="30" w:type="dxa"/>
+              <w:bottom w:w="30" w:type="dxa"/>
+              <w:right w:w="30" w:type="dxa"/>
+            </w:tcMar>
+            <w:hideMark/>
+          </w:tcPr>
+          <w:p>
+            <w:pPr>
+              <w:spacing w:after="90"/>
+              <w:rPr>
+                <w:rFonts w:asciiTheme="minorHAnsi" w:hAnsiTheme="minorHAnsi" w:cstheme="minorHAnsi"/>
+                <w:sz w:val="24"/>
+                <w:szCs w:val="24"/>
+              </w:rPr>
+            </w:pPr>
+            <w:r>
+              <w:rPr>
+                <w:rFonts w:asciiTheme="minorHAnsi" w:hAnsiTheme="minorHAnsi" w:cstheme="minorHAnsi"/>
+                <w:b/>
+                <w:bCs/>
+                <w:sz w:val="24"/>
+                <w:szCs w:val="24"/>
+              </w:rPr>
+              <w:t xml:space="preserve">Kode </w:t>
+            </w:r>
+            <w:proofErr w:type="spellStart"/>
+            <w:r>
+              <w:rPr>
+                <w:rFonts w:asciiTheme="minorHAnsi" w:hAnsiTheme="minorHAnsi" w:cstheme="minorHAnsi"/>
+                <w:b/>
+                <w:bCs/>
+                <w:sz w:val="24"/>
+                <w:szCs w:val="24"/>
+              </w:rPr>
+              <w:t>verifikasi</w:t>
+            </w:r>
+            <w:proofErr w:type="spellEnd"/>
+          </w:p>
+        </w:tc>
+        <w:tc>
+          <w:tcPr>
+            <w:tcW w:w="3563" w:type="dxa"/>
+            <w:shd w:val="clear" w:color="auto" w:fill="FFFFFF" w:themeFill="background1"/>
+            <w:tcMar>
+              <w:top w:w="30" w:type="dxa"/>
+              <w:left w:w="30" w:type="dxa"/>
+              <w:bottom w:w="30" w:type="dxa"/>
+              <w:right w:w="30" w:type="dxa"/>
+            </w:tcMar>
+            <w:hideMark/>
+          </w:tcPr>
+          <w:p>
+            <w:pPr>
+              <w:spacing w:after="90"/>
+              <w:rPr>
+                <w:rFonts w:asciiTheme="minorHAnsi" w:hAnsiTheme="minorHAnsi" w:cstheme="minorHAnsi"/>
+                <w:sz w:val="24"/>
+                <w:szCs w:val="24"/>
+              </w:rPr>
+            </w:pPr>
+            <w:r>
+              <w:rPr>
+                <w:rFonts w:asciiTheme="minorHAnsi" w:hAnsiTheme="minorHAnsi" w:cstheme="minorHAnsi"/>
+                <w:sz w:val="24"/>
+                <w:szCs w:val="24"/>
+              </w:rPr>
+              <w:t xml:space="preserve">PREFIX-YYMM-XXXXXX Crockford Base32, generate-retry </w:t>
+            </w:r>
+            <w:proofErr w:type="spellStart"/>
+            <w:r>
+              <w:rPr>
+                <w:rFonts w:asciiTheme="minorHAnsi" w:hAnsiTheme="minorHAnsi" w:cstheme="minorHAnsi"/>
+                <w:sz w:val="24"/>
+                <w:szCs w:val="24"/>
+              </w:rPr>
+              <w:t>kalau</w:t>
+            </w:r>
+            <w:proofErr w:type="spellEnd"/>
+            <w:r>
+              <w:rPr>
+                <w:rFonts w:asciiTheme="minorHAnsi" w:hAnsiTheme="minorHAnsi" w:cstheme="minorHAnsi"/>
+                <w:sz w:val="24"/>
+                <w:szCs w:val="24"/>
+              </w:rPr>
+              <w:t xml:space="preserve"> </w:t>
+            </w:r>
+            <w:proofErr w:type="spellStart"/>
+            <w:r>
+              <w:rPr>
+                <w:rFonts w:asciiTheme="minorHAnsi" w:hAnsiTheme="minorHAnsi" w:cstheme="minorHAnsi"/>
+                <w:sz w:val="24"/>
+                <w:szCs w:val="24"/>
+              </w:rPr>
+              <w:t>bentrok</w:t>
+            </w:r>
+            <w:proofErr w:type="spellEnd"/>
+          </w:p>
+        </w:tc>
+        <w:tc>
+          <w:tcPr>
+            <w:tcW w:w="0" w:type="auto"/>
+            <w:shd w:val="clear" w:color="auto" w:fill="FFFFFF" w:themeFill="background1"/>
+            <w:tcMar>
+              <w:top w:w="30" w:type="dxa"/>
+              <w:left w:w="30" w:type="dxa"/>
+              <w:bottom w:w="30" w:type="dxa"/>
+              <w:right w:w="30" w:type="dxa"/>
+            </w:tcMar>
+            <w:hideMark/>
+          </w:tcPr>
+          <w:p>
+            <w:pPr>
+              <w:spacing w:after="90"/>
+              <w:rPr>
+                <w:rFonts w:asciiTheme="minorHAnsi" w:hAnsiTheme="minorHAnsi" w:cstheme="minorHAnsi"/>
+                <w:sz w:val="24"/>
+                <w:szCs w:val="24"/>
+              </w:rPr>
+            </w:pPr>
+            <w:r>
+              <w:rPr>
+                <w:rFonts w:asciiTheme="minorHAnsi" w:hAnsiTheme="minorHAnsi" w:cstheme="minorHAnsi"/>
+                <w:sz w:val="24"/>
+                <w:szCs w:val="24"/>
+              </w:rPr>
+              <w:t>{4digit-</w:t>
+            </w:r>
+            <w:proofErr w:type="gramStart"/>
+            <w:r>
+              <w:rPr>
+                <w:rFonts w:asciiTheme="minorHAnsi" w:hAnsiTheme="minorHAnsi" w:cstheme="minorHAnsi"/>
+                <w:sz w:val="24"/>
+                <w:szCs w:val="24"/>
+              </w:rPr>
+              <w:t>nomor}{</w:t>
+            </w:r>
+            <w:proofErr w:type="spellStart"/>
+            <w:proofErr w:type="gramEnd"/>
+            <w:r>
+              <w:rPr>
+                <w:rFonts w:asciiTheme="minorHAnsi" w:hAnsiTheme="minorHAnsi" w:cstheme="minorHAnsi"/>
+                <w:sz w:val="24"/>
+                <w:szCs w:val="24"/>
+              </w:rPr>
+              <w:t>inisial</w:t>
+            </w:r>
+            <w:proofErr w:type="spellEnd"/>
+            <w:r>
+              <w:rPr>
+                <w:rFonts w:asciiTheme="minorHAnsi" w:hAnsiTheme="minorHAnsi" w:cstheme="minorHAnsi"/>
+                <w:sz w:val="24"/>
+                <w:szCs w:val="24"/>
+              </w:rPr>
+              <w:t xml:space="preserve"> </w:t>
+            </w:r>
+            <w:proofErr w:type="spellStart"/>
+            <w:r>
+              <w:rPr>
+                <w:rFonts w:asciiTheme="minorHAnsi" w:hAnsiTheme="minorHAnsi" w:cstheme="minorHAnsi"/>
+                <w:sz w:val="24"/>
+                <w:szCs w:val="24"/>
+              </w:rPr>
+              <w:t>peran</w:t>
+            </w:r>
+            <w:proofErr w:type="spellEnd"/>
+            <w:r>
+              <w:rPr>
+                <w:rFonts w:asciiTheme="minorHAnsi" w:hAnsiTheme="minorHAnsi" w:cstheme="minorHAnsi"/>
+                <w:sz w:val="24"/>
+                <w:szCs w:val="24"/>
+              </w:rPr>
+              <w:t>}</w:t>
+            </w:r>
+            <w:proofErr w:type="gramStart"/>
+            <w:r>
+              <w:rPr>
+                <w:rFonts w:asciiTheme="minorHAnsi" w:hAnsiTheme="minorHAnsi" w:cstheme="minorHAnsi"/>
+                <w:sz w:val="24"/>
+                <w:szCs w:val="24"/>
+              </w:rPr>
+              <w:t>-{</w:t>
+            </w:r>
+            <w:proofErr w:type="gramEnd"/>
+            <w:r>
+              <w:rPr>
+                <w:rFonts w:asciiTheme="minorHAnsi" w:hAnsiTheme="minorHAnsi" w:cstheme="minorHAnsi"/>
+                <w:sz w:val="24"/>
+                <w:szCs w:val="24"/>
+              </w:rPr>
+              <w:t xml:space="preserve">6 hex </w:t>
+            </w:r>
+            <w:proofErr w:type="spellStart"/>
+            <w:r>
+              <w:rPr>
+                <w:rFonts w:asciiTheme="minorHAnsi" w:hAnsiTheme="minorHAnsi" w:cstheme="minorHAnsi"/>
+                <w:sz w:val="24"/>
+                <w:szCs w:val="24"/>
+              </w:rPr>
+              <w:t>acak</w:t>
+            </w:r>
+            <w:proofErr w:type="spellEnd"/>
+            <w:r>
+              <w:rPr>
+                <w:rFonts w:asciiTheme="minorHAnsi" w:hAnsiTheme="minorHAnsi" w:cstheme="minorHAnsi"/>
+                <w:sz w:val="24"/>
+                <w:szCs w:val="24"/>
+              </w:rPr>
+              <w:t xml:space="preserve">}, </w:t>
+            </w:r>
+            <w:proofErr w:type="spellStart"/>
+            <w:r>
+              <w:rPr>
+                <w:rFonts w:asciiTheme="minorHAnsi" w:hAnsiTheme="minorHAnsi" w:cstheme="minorHAnsi"/>
+                <w:sz w:val="24"/>
+                <w:szCs w:val="24"/>
+              </w:rPr>
+              <w:t>cek</w:t>
+            </w:r>
+            <w:proofErr w:type="spellEnd"/>
+            <w:r>
+              <w:rPr>
+                <w:rFonts w:asciiTheme="minorHAnsi" w:hAnsiTheme="minorHAnsi" w:cstheme="minorHAnsi"/>
+                <w:sz w:val="24"/>
+                <w:szCs w:val="24"/>
+              </w:rPr>
+              <w:t xml:space="preserve"> </w:t>
+            </w:r>
+            <w:proofErr w:type="spellStart"/>
+            <w:r>
+              <w:rPr>
+                <w:rFonts w:asciiTheme="minorHAnsi" w:hAnsiTheme="minorHAnsi" w:cstheme="minorHAnsi"/>
+                <w:sz w:val="24"/>
+                <w:szCs w:val="24"/>
+              </w:rPr>
+              <w:t>bentrok</w:t>
+            </w:r>
+            <w:proofErr w:type="spellEnd"/>
+            <w:r>
+              <w:rPr>
+                <w:rFonts w:asciiTheme="minorHAnsi" w:hAnsiTheme="minorHAnsi" w:cstheme="minorHAnsi"/>
+                <w:sz w:val="24"/>
+                <w:szCs w:val="24"/>
+              </w:rPr>
+              <w:t xml:space="preserve"> juga </w:t>
+            </w:r>
+            <w:proofErr w:type="spellStart"/>
+            <w:r>
+              <w:rPr>
+                <w:rFonts w:asciiTheme="minorHAnsi" w:hAnsiTheme="minorHAnsi" w:cstheme="minorHAnsi"/>
+                <w:sz w:val="24"/>
+                <w:szCs w:val="24"/>
+              </w:rPr>
+              <w:t>ada</w:t>
+            </w:r>
+            <w:proofErr w:type="spellEnd"/>
+          </w:p>
+        </w:tc>
+      </w:tr>
+      <w:tr>
+        <w:tc>
+          <w:tcPr>
+            <w:tcW w:w="1154" w:type="dxa"/>
+            <w:shd w:val="clear" w:color="auto" w:fill="FFFFFF" w:themeFill="background1"/>
+            <w:tcMar>
+              <w:top w:w="30" w:type="dxa"/>
+              <w:left w:w="30" w:type="dxa"/>
+              <w:bottom w:w="30" w:type="dxa"/>
+              <w:right w:w="30" w:type="dxa"/>
+            </w:tcMar>
+            <w:vAlign w:val="center"/>
+            <w:hideMark/>
+          </w:tcPr>
+          <w:p>
+            <w:pPr>
+              <w:spacing w:after="90"/>
+              <w:rPr>
+                <w:rFonts w:asciiTheme="minorHAnsi" w:hAnsiTheme="minorHAnsi" w:cstheme="minorHAnsi"/>
+                <w:sz w:val="24"/>
+                <w:szCs w:val="24"/>
+              </w:rPr>
+            </w:pPr>
+            <w:r>
+              <w:rPr>
+                <w:rFonts w:asciiTheme="minorHAnsi" w:hAnsiTheme="minorHAnsi" w:cstheme="minorHAnsi"/>
+                <w:b/>
+                <w:bCs/>
+                <w:sz w:val="24"/>
+                <w:szCs w:val="24"/>
+              </w:rPr>
+              <w:t xml:space="preserve">Rate limit </w:t>
+            </w:r>
+            <w:proofErr w:type="spellStart"/>
+            <w:r>
+              <w:rPr>
+                <w:rFonts w:asciiTheme="minorHAnsi" w:hAnsiTheme="minorHAnsi" w:cstheme="minorHAnsi"/>
+                <w:b/>
+                <w:bCs/>
+                <w:sz w:val="24"/>
+                <w:szCs w:val="24"/>
+              </w:rPr>
+              <w:t>verifikasi</w:t>
+            </w:r>
+            <w:proofErr w:type="spellEnd"/>
+            <w:r>
+              <w:rPr>
+                <w:rFonts w:asciiTheme="minorHAnsi" w:hAnsiTheme="minorHAnsi" w:cstheme="minorHAnsi"/>
+                <w:b/>
+                <w:bCs/>
+                <w:sz w:val="24"/>
+                <w:szCs w:val="24"/>
+              </w:rPr>
+              <w:t xml:space="preserve"> </w:t>
+            </w:r>
+            <w:proofErr w:type="spellStart"/>
+            <w:r>
+              <w:rPr>
+                <w:rFonts w:asciiTheme="minorHAnsi" w:hAnsiTheme="minorHAnsi" w:cstheme="minorHAnsi"/>
+                <w:b/>
+                <w:bCs/>
+                <w:sz w:val="24"/>
+                <w:szCs w:val="24"/>
+              </w:rPr>
+              <w:t>publik</w:t>
+            </w:r>
+            <w:proofErr w:type="spellEnd"/>
+          </w:p>
+        </w:tc>
+        <w:tc>
+          <w:tcPr>
+            <w:tcW w:w="3563" w:type="dxa"/>
+            <w:shd w:val="clear" w:color="auto" w:fill="FFFFFF" w:themeFill="background1"/>
+            <w:tcMar>
+              <w:top w:w="30" w:type="dxa"/>
+              <w:left w:w="30" w:type="dxa"/>
+              <w:bottom w:w="30" w:type="dxa"/>
+              <w:right w:w="30" w:type="dxa"/>
+            </w:tcMar>
+            <w:hideMark/>
+          </w:tcPr>
+          <w:p>
+            <w:pPr>
+              <w:spacing w:after="90"/>
+              <w:rPr>
+                <w:rFonts w:asciiTheme="minorHAnsi" w:hAnsiTheme="minorHAnsi" w:cstheme="minorHAnsi"/>
+                <w:sz w:val="24"/>
+                <w:szCs w:val="24"/>
+              </w:rPr>
+            </w:pPr>
+            <w:r>
+              <w:rPr>
+                <w:rFonts w:asciiTheme="minorHAnsi" w:hAnsiTheme="minorHAnsi" w:cstheme="minorHAnsi"/>
+                <w:sz w:val="24"/>
+                <w:szCs w:val="24"/>
+              </w:rPr>
+              <w:t>Ada (throttle:20,1)</w:t>
+            </w:r>
+          </w:p>
+        </w:tc>
+        <w:tc>
+          <w:tcPr>
+            <w:tcW w:w="0" w:type="auto"/>
+            <w:shd w:val="clear" w:color="auto" w:fill="FFFFFF" w:themeFill="background1"/>
+            <w:tcMar>
+              <w:top w:w="30" w:type="dxa"/>
+              <w:left w:w="30" w:type="dxa"/>
+              <w:bottom w:w="30" w:type="dxa"/>
+              <w:right w:w="30" w:type="dxa"/>
+            </w:tcMar>
+            <w:hideMark/>
+          </w:tcPr>
+          <w:p>
+            <w:pPr>
+              <w:spacing w:after="90"/>
+              <w:rPr>
+                <w:rFonts w:asciiTheme="minorHAnsi" w:hAnsiTheme="minorHAnsi" w:cstheme="minorHAnsi"/>
+                <w:sz w:val="24"/>
+                <w:szCs w:val="24"/>
+              </w:rPr>
+            </w:pPr>
+            <w:r>
+              <w:rPr>
+                <w:rFonts w:asciiTheme="minorHAnsi" w:hAnsiTheme="minorHAnsi" w:cstheme="minorHAnsi"/>
+                <w:sz w:val="24"/>
+                <w:szCs w:val="24"/>
+              </w:rPr>
+              <w:t xml:space="preserve">Tidak </w:t>
+            </w:r>
+            <w:proofErr w:type="spellStart"/>
+            <w:r>
+              <w:rPr>
+                <w:rFonts w:asciiTheme="minorHAnsi" w:hAnsiTheme="minorHAnsi" w:cstheme="minorHAnsi"/>
+                <w:sz w:val="24"/>
+                <w:szCs w:val="24"/>
+              </w:rPr>
+              <w:t>terlihat</w:t>
+            </w:r>
+            <w:proofErr w:type="spellEnd"/>
+            <w:r>
+              <w:rPr>
+                <w:rFonts w:asciiTheme="minorHAnsi" w:hAnsiTheme="minorHAnsi" w:cstheme="minorHAnsi"/>
+                <w:sz w:val="24"/>
+                <w:szCs w:val="24"/>
+              </w:rPr>
+              <w:t xml:space="preserve"> </w:t>
+            </w:r>
+            <w:proofErr w:type="spellStart"/>
+            <w:r>
+              <w:rPr>
+                <w:rFonts w:asciiTheme="minorHAnsi" w:hAnsiTheme="minorHAnsi" w:cstheme="minorHAnsi"/>
+                <w:sz w:val="24"/>
+                <w:szCs w:val="24"/>
+              </w:rPr>
+              <w:t>ada</w:t>
+            </w:r>
+            <w:proofErr w:type="spellEnd"/>
+            <w:r>
+              <w:rPr>
+                <w:rFonts w:asciiTheme="minorHAnsi" w:hAnsiTheme="minorHAnsi" w:cstheme="minorHAnsi"/>
+                <w:sz w:val="24"/>
+                <w:szCs w:val="24"/>
+              </w:rPr>
+              <w:t xml:space="preserve"> throttle di </w:t>
+            </w:r>
+            <w:proofErr w:type="spellStart"/>
+            <w:r>
+              <w:rPr>
+                <w:rFonts w:asciiTheme="minorHAnsi" w:hAnsiTheme="minorHAnsi" w:cstheme="minorHAnsi"/>
+                <w:sz w:val="24"/>
+                <w:szCs w:val="24"/>
+              </w:rPr>
+              <w:t>verifikasi.php</w:t>
+            </w:r>
+            <w:proofErr w:type="spellEnd"/>
+          </w:p>
+        </w:tc>
+      </w:tr>
+      <w:tr>
+        <w:tc>
+          <w:tcPr>
+            <w:tcW w:w="1154" w:type="dxa"/>
+            <w:shd w:val="clear" w:color="auto" w:fill="FFFFFF" w:themeFill="background1"/>
+            <w:tcMar>
+              <w:top w:w="30" w:type="dxa"/>
+              <w:left w:w="30" w:type="dxa"/>
+              <w:bottom w:w="30" w:type="dxa"/>
+              <w:right w:w="30" w:type="dxa"/>
+            </w:tcMar>
+            <w:vAlign w:val="center"/>
+            <w:hideMark/>
+          </w:tcPr>
+          <w:p>
+            <w:pPr>
+              <w:spacing w:after="90"/>
+              <w:rPr>
+                <w:rFonts w:asciiTheme="minorHAnsi" w:hAnsiTheme="minorHAnsi" w:cstheme="minorHAnsi"/>
+                <w:sz w:val="24"/>
+                <w:szCs w:val="24"/>
+              </w:rPr>
+            </w:pPr>
+            <w:r>
+              <w:rPr>
+                <w:rFonts w:asciiTheme="minorHAnsi" w:hAnsiTheme="minorHAnsi" w:cstheme="minorHAnsi"/>
+                <w:b/>
+                <w:bCs/>
+                <w:sz w:val="24"/>
+                <w:szCs w:val="24"/>
+              </w:rPr>
+              <w:t>Revocation</w:t>
+            </w:r>
+          </w:p>
+        </w:tc>
+        <w:tc>
+          <w:tcPr>
+            <w:tcW w:w="3563" w:type="dxa"/>
+            <w:shd w:val="clear" w:color="auto" w:fill="FFFFFF" w:themeFill="background1"/>
+            <w:tcMar>
+              <w:top w:w="30" w:type="dxa"/>
+              <w:left w:w="30" w:type="dxa"/>
+              <w:bottom w:w="30" w:type="dxa"/>
+              <w:right w:w="30" w:type="dxa"/>
+            </w:tcMar>
+            <w:hideMark/>
+          </w:tcPr>
+          <w:p>
+            <w:pPr>
+              <w:spacing w:after="90"/>
+              <w:rPr>
+                <w:rFonts w:asciiTheme="minorHAnsi" w:hAnsiTheme="minorHAnsi" w:cstheme="minorHAnsi"/>
+                <w:sz w:val="24"/>
+                <w:szCs w:val="24"/>
+              </w:rPr>
+            </w:pPr>
+            <w:r>
+              <w:rPr>
+                <w:rFonts w:asciiTheme="minorHAnsi" w:hAnsiTheme="minorHAnsi" w:cstheme="minorHAnsi"/>
+                <w:sz w:val="24"/>
+                <w:szCs w:val="24"/>
+              </w:rPr>
+              <w:t xml:space="preserve">Status DICABUT </w:t>
+            </w:r>
+            <w:proofErr w:type="spellStart"/>
+            <w:r>
+              <w:rPr>
+                <w:rFonts w:asciiTheme="minorHAnsi" w:hAnsiTheme="minorHAnsi" w:cstheme="minorHAnsi"/>
+                <w:sz w:val="24"/>
+                <w:szCs w:val="24"/>
+              </w:rPr>
+              <w:t>dihitung</w:t>
+            </w:r>
+            <w:proofErr w:type="spellEnd"/>
+            <w:r>
+              <w:rPr>
+                <w:rFonts w:asciiTheme="minorHAnsi" w:hAnsiTheme="minorHAnsi" w:cstheme="minorHAnsi"/>
+                <w:sz w:val="24"/>
+                <w:szCs w:val="24"/>
+              </w:rPr>
+              <w:t xml:space="preserve"> live </w:t>
+            </w:r>
+            <w:proofErr w:type="spellStart"/>
+            <w:r>
+              <w:rPr>
+                <w:rFonts w:asciiTheme="minorHAnsi" w:hAnsiTheme="minorHAnsi" w:cstheme="minorHAnsi"/>
+                <w:sz w:val="24"/>
+                <w:szCs w:val="24"/>
+              </w:rPr>
+              <w:t>dari</w:t>
+            </w:r>
+            <w:proofErr w:type="spellEnd"/>
+            <w:r>
+              <w:rPr>
+                <w:rFonts w:asciiTheme="minorHAnsi" w:hAnsiTheme="minorHAnsi" w:cstheme="minorHAnsi"/>
+                <w:sz w:val="24"/>
+                <w:szCs w:val="24"/>
+              </w:rPr>
+              <w:t> </w:t>
+            </w:r>
+            <w:proofErr w:type="spellStart"/>
+            <w:r>
+              <w:rPr>
+                <w:rFonts w:asciiTheme="minorHAnsi" w:hAnsiTheme="minorHAnsi" w:cstheme="minorHAnsi"/>
+                <w:sz w:val="24"/>
+                <w:szCs w:val="24"/>
+              </w:rPr>
+              <w:t>cancelled_at</w:t>
+            </w:r>
+            <w:proofErr w:type="spellEnd"/>
+          </w:p>
+        </w:tc>
+        <w:tc>
+          <w:tcPr>
+            <w:tcW w:w="0" w:type="auto"/>
+            <w:shd w:val="clear" w:color="auto" w:fill="FFFFFF" w:themeFill="background1"/>
+            <w:tcMar>
+              <w:top w:w="30" w:type="dxa"/>
+              <w:left w:w="30" w:type="dxa"/>
+              <w:bottom w:w="30" w:type="dxa"/>
+              <w:right w:w="30" w:type="dxa"/>
+            </w:tcMar>
+            <w:hideMark/>
+          </w:tcPr>
+          <w:p>
+            <w:pPr>
+              <w:spacing w:after="90"/>
+              <w:rPr>
+                <w:rFonts w:asciiTheme="minorHAnsi" w:hAnsiTheme="minorHAnsi" w:cstheme="minorHAnsi"/>
+                <w:sz w:val="24"/>
+                <w:szCs w:val="24"/>
+              </w:rPr>
+            </w:pPr>
+            <w:r>
+              <w:rPr>
+                <w:rFonts w:asciiTheme="minorHAnsi" w:hAnsiTheme="minorHAnsi" w:cstheme="minorHAnsi"/>
+                <w:sz w:val="24"/>
+                <w:szCs w:val="24"/>
+              </w:rPr>
+              <w:t xml:space="preserve">Halaman </w:t>
+            </w:r>
+            <w:proofErr w:type="spellStart"/>
+            <w:r>
+              <w:rPr>
+                <w:rFonts w:asciiTheme="minorHAnsi" w:hAnsiTheme="minorHAnsi" w:cstheme="minorHAnsi"/>
+                <w:sz w:val="24"/>
+                <w:szCs w:val="24"/>
+              </w:rPr>
+              <w:t>verifikasi</w:t>
+            </w:r>
+            <w:proofErr w:type="spellEnd"/>
+            <w:r>
+              <w:rPr>
+                <w:rFonts w:asciiTheme="minorHAnsi" w:hAnsiTheme="minorHAnsi" w:cstheme="minorHAnsi"/>
+                <w:sz w:val="24"/>
+                <w:szCs w:val="24"/>
+              </w:rPr>
+              <w:t xml:space="preserve"> </w:t>
+            </w:r>
+            <w:proofErr w:type="spellStart"/>
+            <w:r>
+              <w:rPr>
+                <w:rFonts w:asciiTheme="minorHAnsi" w:hAnsiTheme="minorHAnsi" w:cstheme="minorHAnsi"/>
+                <w:sz w:val="24"/>
+                <w:szCs w:val="24"/>
+              </w:rPr>
+              <w:t>nampilin</w:t>
+            </w:r>
+            <w:proofErr w:type="spellEnd"/>
+            <w:r>
+              <w:rPr>
+                <w:rFonts w:asciiTheme="minorHAnsi" w:hAnsiTheme="minorHAnsi" w:cstheme="minorHAnsi"/>
+                <w:sz w:val="24"/>
+                <w:szCs w:val="24"/>
+              </w:rPr>
+              <w:t> status </w:t>
+            </w:r>
+            <w:proofErr w:type="spellStart"/>
+            <w:r>
+              <w:rPr>
+                <w:rFonts w:asciiTheme="minorHAnsi" w:hAnsiTheme="minorHAnsi" w:cstheme="minorHAnsi"/>
+                <w:sz w:val="24"/>
+                <w:szCs w:val="24"/>
+              </w:rPr>
+              <w:t>permohonan</w:t>
+            </w:r>
+            <w:proofErr w:type="spellEnd"/>
+            <w:r>
+              <w:rPr>
+                <w:rFonts w:asciiTheme="minorHAnsi" w:hAnsiTheme="minorHAnsi" w:cstheme="minorHAnsi"/>
+                <w:sz w:val="24"/>
+                <w:szCs w:val="24"/>
+              </w:rPr>
+              <w:t xml:space="preserve"> </w:t>
+            </w:r>
+            <w:proofErr w:type="spellStart"/>
+            <w:r>
+              <w:rPr>
+                <w:rFonts w:asciiTheme="minorHAnsi" w:hAnsiTheme="minorHAnsi" w:cstheme="minorHAnsi"/>
+                <w:sz w:val="24"/>
+                <w:szCs w:val="24"/>
+              </w:rPr>
+              <w:t>apa</w:t>
+            </w:r>
+            <w:proofErr w:type="spellEnd"/>
+            <w:r>
+              <w:rPr>
+                <w:rFonts w:asciiTheme="minorHAnsi" w:hAnsiTheme="minorHAnsi" w:cstheme="minorHAnsi"/>
+                <w:sz w:val="24"/>
+                <w:szCs w:val="24"/>
+              </w:rPr>
+              <w:t xml:space="preserve"> </w:t>
+            </w:r>
+            <w:proofErr w:type="spellStart"/>
+            <w:r>
+              <w:rPr>
+                <w:rFonts w:asciiTheme="minorHAnsi" w:hAnsiTheme="minorHAnsi" w:cstheme="minorHAnsi"/>
+                <w:sz w:val="24"/>
+                <w:szCs w:val="24"/>
+              </w:rPr>
+              <w:lastRenderedPageBreak/>
+              <w:t>adanya</w:t>
+            </w:r>
+            <w:proofErr w:type="spellEnd"/>
+            <w:r>
+              <w:rPr>
+                <w:rFonts w:asciiTheme="minorHAnsi" w:hAnsiTheme="minorHAnsi" w:cstheme="minorHAnsi"/>
+                <w:sz w:val="24"/>
+                <w:szCs w:val="24"/>
+              </w:rPr>
+              <w:t xml:space="preserve"> (</w:t>
+            </w:r>
+            <w:proofErr w:type="spellStart"/>
+            <w:r>
+              <w:rPr>
+                <w:rFonts w:asciiTheme="minorHAnsi" w:hAnsiTheme="minorHAnsi" w:cstheme="minorHAnsi"/>
+                <w:sz w:val="24"/>
+                <w:szCs w:val="24"/>
+              </w:rPr>
+              <w:t>diajukan</w:t>
+            </w:r>
+            <w:proofErr w:type="spellEnd"/>
+            <w:r>
+              <w:rPr>
+                <w:rFonts w:asciiTheme="minorHAnsi" w:hAnsiTheme="minorHAnsi" w:cstheme="minorHAnsi"/>
+                <w:sz w:val="24"/>
+                <w:szCs w:val="24"/>
+              </w:rPr>
+              <w:t>/</w:t>
+            </w:r>
+            <w:proofErr w:type="spellStart"/>
+            <w:r>
+              <w:rPr>
+                <w:rFonts w:asciiTheme="minorHAnsi" w:hAnsiTheme="minorHAnsi" w:cstheme="minorHAnsi"/>
+                <w:sz w:val="24"/>
+                <w:szCs w:val="24"/>
+              </w:rPr>
+              <w:t>ditolak</w:t>
+            </w:r>
+            <w:proofErr w:type="spellEnd"/>
+            <w:r>
+              <w:rPr>
+                <w:rFonts w:asciiTheme="minorHAnsi" w:hAnsiTheme="minorHAnsi" w:cstheme="minorHAnsi"/>
+                <w:sz w:val="24"/>
+                <w:szCs w:val="24"/>
+              </w:rPr>
+              <w:t>/</w:t>
+            </w:r>
+            <w:proofErr w:type="spellStart"/>
+            <w:r>
+              <w:rPr>
+                <w:rFonts w:asciiTheme="minorHAnsi" w:hAnsiTheme="minorHAnsi" w:cstheme="minorHAnsi"/>
+                <w:sz w:val="24"/>
+                <w:szCs w:val="24"/>
+              </w:rPr>
+              <w:t>dst</w:t>
+            </w:r>
+            <w:proofErr w:type="spellEnd"/>
+            <w:r>
+              <w:rPr>
+                <w:rFonts w:asciiTheme="minorHAnsi" w:hAnsiTheme="minorHAnsi" w:cstheme="minorHAnsi"/>
+                <w:sz w:val="24"/>
+                <w:szCs w:val="24"/>
+              </w:rPr>
+              <w:t xml:space="preserve">), </w:t>
+            </w:r>
+            <w:proofErr w:type="spellStart"/>
+            <w:r>
+              <w:rPr>
+                <w:rFonts w:asciiTheme="minorHAnsi" w:hAnsiTheme="minorHAnsi" w:cstheme="minorHAnsi"/>
+                <w:sz w:val="24"/>
+                <w:szCs w:val="24"/>
+              </w:rPr>
+              <w:t>bukan</w:t>
+            </w:r>
+            <w:proofErr w:type="spellEnd"/>
+            <w:r>
+              <w:rPr>
+                <w:rFonts w:asciiTheme="minorHAnsi" w:hAnsiTheme="minorHAnsi" w:cstheme="minorHAnsi"/>
+                <w:sz w:val="24"/>
+                <w:szCs w:val="24"/>
+              </w:rPr>
+              <w:t xml:space="preserve"> </w:t>
+            </w:r>
+            <w:proofErr w:type="spellStart"/>
+            <w:r>
+              <w:rPr>
+                <w:rFonts w:asciiTheme="minorHAnsi" w:hAnsiTheme="minorHAnsi" w:cstheme="minorHAnsi"/>
+                <w:sz w:val="24"/>
+                <w:szCs w:val="24"/>
+              </w:rPr>
+              <w:t>konsep</w:t>
+            </w:r>
+            <w:proofErr w:type="spellEnd"/>
+            <w:r>
+              <w:rPr>
+                <w:rFonts w:asciiTheme="minorHAnsi" w:hAnsiTheme="minorHAnsi" w:cstheme="minorHAnsi"/>
+                <w:sz w:val="24"/>
+                <w:szCs w:val="24"/>
+              </w:rPr>
+              <w:t xml:space="preserve"> "</w:t>
+            </w:r>
+            <w:proofErr w:type="spellStart"/>
+            <w:r>
+              <w:rPr>
+                <w:rFonts w:asciiTheme="minorHAnsi" w:hAnsiTheme="minorHAnsi" w:cstheme="minorHAnsi"/>
+                <w:sz w:val="24"/>
+                <w:szCs w:val="24"/>
+              </w:rPr>
+              <w:t>dicabut</w:t>
+            </w:r>
+            <w:proofErr w:type="spellEnd"/>
+            <w:r>
+              <w:rPr>
+                <w:rFonts w:asciiTheme="minorHAnsi" w:hAnsiTheme="minorHAnsi" w:cstheme="minorHAnsi"/>
+                <w:sz w:val="24"/>
+                <w:szCs w:val="24"/>
+              </w:rPr>
+              <w:t>"</w:t>
+            </w:r>
+          </w:p>
+        </w:tc>
+      </w:tr>
+      <w:tr>
+        <w:tc>
+          <w:tcPr>
+            <w:tcW w:w="1154" w:type="dxa"/>
+            <w:shd w:val="clear" w:color="auto" w:fill="FFFFFF" w:themeFill="background1"/>
+            <w:tcMar>
+              <w:top w:w="30" w:type="dxa"/>
+              <w:left w:w="30" w:type="dxa"/>
+              <w:bottom w:w="30" w:type="dxa"/>
+              <w:right w:w="30" w:type="dxa"/>
+            </w:tcMar>
+            <w:vAlign w:val="center"/>
+            <w:hideMark/>
+          </w:tcPr>
+          <w:p>
+            <w:pPr>
+              <w:spacing w:after="90"/>
+              <w:rPr>
+                <w:rFonts w:asciiTheme="minorHAnsi" w:hAnsiTheme="minorHAnsi" w:cstheme="minorHAnsi"/>
+                <w:sz w:val="24"/>
+                <w:szCs w:val="24"/>
+              </w:rPr>
+            </w:pPr>
+            <w:proofErr w:type="spellStart"/>
+            <w:r>
+              <w:rPr>
+                <w:rFonts w:asciiTheme="minorHAnsi" w:hAnsiTheme="minorHAnsi" w:cstheme="minorHAnsi"/>
+                <w:b/>
+                <w:bCs/>
+                <w:sz w:val="24"/>
+                <w:szCs w:val="24"/>
+              </w:rPr>
+              <w:lastRenderedPageBreak/>
+              <w:t>Generik</w:t>
+            </w:r>
+            <w:proofErr w:type="spellEnd"/>
+            <w:r>
+              <w:rPr>
+                <w:rFonts w:asciiTheme="minorHAnsi" w:hAnsiTheme="minorHAnsi" w:cstheme="minorHAnsi"/>
+                <w:b/>
+                <w:bCs/>
+                <w:sz w:val="24"/>
+                <w:szCs w:val="24"/>
+              </w:rPr>
+              <w:t xml:space="preserve"> </w:t>
+            </w:r>
+            <w:proofErr w:type="spellStart"/>
+            <w:r>
+              <w:rPr>
+                <w:rFonts w:asciiTheme="minorHAnsi" w:hAnsiTheme="minorHAnsi" w:cstheme="minorHAnsi"/>
+                <w:b/>
+                <w:bCs/>
+                <w:sz w:val="24"/>
+                <w:szCs w:val="24"/>
+              </w:rPr>
+              <w:t>lintas</w:t>
+            </w:r>
+            <w:proofErr w:type="spellEnd"/>
+            <w:r>
+              <w:rPr>
+                <w:rFonts w:asciiTheme="minorHAnsi" w:hAnsiTheme="minorHAnsi" w:cstheme="minorHAnsi"/>
+                <w:b/>
+                <w:bCs/>
+                <w:sz w:val="24"/>
+                <w:szCs w:val="24"/>
+              </w:rPr>
+              <w:t xml:space="preserve"> </w:t>
+            </w:r>
+            <w:proofErr w:type="spellStart"/>
+            <w:r>
+              <w:rPr>
+                <w:rFonts w:asciiTheme="minorHAnsi" w:hAnsiTheme="minorHAnsi" w:cstheme="minorHAnsi"/>
+                <w:b/>
+                <w:bCs/>
+                <w:sz w:val="24"/>
+                <w:szCs w:val="24"/>
+              </w:rPr>
+              <w:t>jenis</w:t>
+            </w:r>
+            <w:proofErr w:type="spellEnd"/>
+            <w:r>
+              <w:rPr>
+                <w:rFonts w:asciiTheme="minorHAnsi" w:hAnsiTheme="minorHAnsi" w:cstheme="minorHAnsi"/>
+                <w:b/>
+                <w:bCs/>
+                <w:sz w:val="24"/>
+                <w:szCs w:val="24"/>
+              </w:rPr>
+              <w:t xml:space="preserve"> </w:t>
+            </w:r>
+            <w:proofErr w:type="spellStart"/>
+            <w:r>
+              <w:rPr>
+                <w:rFonts w:asciiTheme="minorHAnsi" w:hAnsiTheme="minorHAnsi" w:cstheme="minorHAnsi"/>
+                <w:b/>
+                <w:bCs/>
+                <w:sz w:val="24"/>
+                <w:szCs w:val="24"/>
+              </w:rPr>
+              <w:t>dokumen</w:t>
+            </w:r>
+            <w:proofErr w:type="spellEnd"/>
+          </w:p>
+        </w:tc>
+        <w:tc>
+          <w:tcPr>
+            <w:tcW w:w="3563" w:type="dxa"/>
+            <w:shd w:val="clear" w:color="auto" w:fill="FFFFFF" w:themeFill="background1"/>
+            <w:tcMar>
+              <w:top w:w="30" w:type="dxa"/>
+              <w:left w:w="30" w:type="dxa"/>
+              <w:bottom w:w="30" w:type="dxa"/>
+              <w:right w:w="30" w:type="dxa"/>
+            </w:tcMar>
+            <w:hideMark/>
+          </w:tcPr>
+          <w:p>
+            <w:pPr>
+              <w:pStyle w:val="ListParagraph"/>
+              <w:spacing w:after="90"/>
+              <w:ind w:left="720"/>
+              <w:rPr>
+                <w:rFonts w:asciiTheme="minorHAnsi" w:hAnsiTheme="minorHAnsi" w:cstheme="minorHAnsi"/>
+                <w:sz w:val="24"/>
+                <w:szCs w:val="24"/>
+              </w:rPr>
+            </w:pPr>
+            <w:r>
+              <w:rPr>
+                <w:rFonts w:asciiTheme="minorHAnsi" w:hAnsiTheme="minorHAnsi" w:cstheme="minorHAnsi"/>
+                <w:sz w:val="24"/>
+                <w:szCs w:val="24"/>
+              </w:rPr>
+              <w:t>Ya — Signable contract + </w:t>
+            </w:r>
+            <w:proofErr w:type="spellStart"/>
+            <w:r>
+              <w:rPr>
+                <w:rFonts w:asciiTheme="minorHAnsi" w:hAnsiTheme="minorHAnsi" w:cstheme="minorHAnsi"/>
+                <w:sz w:val="24"/>
+                <w:szCs w:val="24"/>
+              </w:rPr>
+              <w:t>DocumentSigningService</w:t>
+            </w:r>
+            <w:proofErr w:type="spellEnd"/>
+            <w:r>
+              <w:rPr>
+                <w:rFonts w:asciiTheme="minorHAnsi" w:hAnsiTheme="minorHAnsi" w:cstheme="minorHAnsi"/>
+                <w:sz w:val="24"/>
+                <w:szCs w:val="24"/>
+              </w:rPr>
+              <w:t xml:space="preserve">, </w:t>
+            </w:r>
+            <w:proofErr w:type="spellStart"/>
+            <w:r>
+              <w:rPr>
+                <w:rFonts w:asciiTheme="minorHAnsi" w:hAnsiTheme="minorHAnsi" w:cstheme="minorHAnsi"/>
+                <w:sz w:val="24"/>
+                <w:szCs w:val="24"/>
+              </w:rPr>
+              <w:t>siap</w:t>
+            </w:r>
+            <w:proofErr w:type="spellEnd"/>
+            <w:r>
+              <w:rPr>
+                <w:rFonts w:asciiTheme="minorHAnsi" w:hAnsiTheme="minorHAnsi" w:cstheme="minorHAnsi"/>
+                <w:sz w:val="24"/>
+                <w:szCs w:val="24"/>
+              </w:rPr>
+              <w:t xml:space="preserve"> </w:t>
+            </w:r>
+            <w:proofErr w:type="spellStart"/>
+            <w:r>
+              <w:rPr>
+                <w:rFonts w:asciiTheme="minorHAnsi" w:hAnsiTheme="minorHAnsi" w:cstheme="minorHAnsi"/>
+                <w:sz w:val="24"/>
+                <w:szCs w:val="24"/>
+              </w:rPr>
+              <w:t>dipakai</w:t>
+            </w:r>
+            <w:proofErr w:type="spellEnd"/>
+            <w:r>
+              <w:rPr>
+                <w:rFonts w:asciiTheme="minorHAnsi" w:hAnsiTheme="minorHAnsi" w:cstheme="minorHAnsi"/>
+                <w:sz w:val="24"/>
+                <w:szCs w:val="24"/>
+              </w:rPr>
+              <w:t xml:space="preserve"> </w:t>
+            </w:r>
+            <w:proofErr w:type="spellStart"/>
+            <w:r>
+              <w:rPr>
+                <w:rFonts w:asciiTheme="minorHAnsi" w:hAnsiTheme="minorHAnsi" w:cstheme="minorHAnsi"/>
+                <w:sz w:val="24"/>
+                <w:szCs w:val="24"/>
+              </w:rPr>
+              <w:t>dokumen</w:t>
+            </w:r>
+            <w:proofErr w:type="spellEnd"/>
+            <w:r>
+              <w:rPr>
+                <w:rFonts w:asciiTheme="minorHAnsi" w:hAnsiTheme="minorHAnsi" w:cstheme="minorHAnsi"/>
+                <w:sz w:val="24"/>
+                <w:szCs w:val="24"/>
+              </w:rPr>
+              <w:t xml:space="preserve"> lain</w:t>
+            </w:r>
+          </w:p>
+        </w:tc>
+        <w:tc>
+          <w:tcPr>
+            <w:tcW w:w="0" w:type="auto"/>
+            <w:shd w:val="clear" w:color="auto" w:fill="FFFFFF" w:themeFill="background1"/>
+            <w:tcMar>
+              <w:top w:w="30" w:type="dxa"/>
+              <w:left w:w="30" w:type="dxa"/>
+              <w:bottom w:w="30" w:type="dxa"/>
+              <w:right w:w="30" w:type="dxa"/>
+            </w:tcMar>
+            <w:hideMark/>
+          </w:tcPr>
+          <w:p>
+            <w:pPr>
+              <w:pStyle w:val="ListParagraph"/>
+              <w:spacing w:after="90"/>
+              <w:ind w:left="720"/>
+              <w:rPr>
+                <w:rFonts w:asciiTheme="minorHAnsi" w:hAnsiTheme="minorHAnsi" w:cstheme="minorHAnsi"/>
+                <w:sz w:val="24"/>
+                <w:szCs w:val="24"/>
+              </w:rPr>
+            </w:pPr>
+            <w:r>
+              <w:rPr>
+                <w:rFonts w:asciiTheme="minorHAnsi" w:hAnsiTheme="minorHAnsi" w:cstheme="minorHAnsi"/>
+                <w:sz w:val="24"/>
+                <w:szCs w:val="24"/>
+              </w:rPr>
+              <w:t>Tidak — </w:t>
+            </w:r>
+            <w:proofErr w:type="spellStart"/>
+            <w:r>
+              <w:rPr>
+                <w:rFonts w:asciiTheme="minorHAnsi" w:hAnsiTheme="minorHAnsi" w:cstheme="minorHAnsi"/>
+                <w:sz w:val="24"/>
+                <w:szCs w:val="24"/>
+              </w:rPr>
+              <w:t>peran</w:t>
+            </w:r>
+            <w:proofErr w:type="spellEnd"/>
+            <w:r>
+              <w:rPr>
+                <w:rFonts w:asciiTheme="minorHAnsi" w:hAnsiTheme="minorHAnsi" w:cstheme="minorHAnsi"/>
+                <w:sz w:val="24"/>
+                <w:szCs w:val="24"/>
+              </w:rPr>
+              <w:t xml:space="preserve"> di-hardcode </w:t>
+            </w:r>
+            <w:proofErr w:type="spellStart"/>
+            <w:r>
+              <w:rPr>
+                <w:rFonts w:asciiTheme="minorHAnsi" w:hAnsiTheme="minorHAnsi" w:cstheme="minorHAnsi"/>
+                <w:sz w:val="24"/>
+                <w:szCs w:val="24"/>
+              </w:rPr>
+              <w:t>enum</w:t>
+            </w:r>
+            <w:proofErr w:type="spellEnd"/>
+            <w:r>
+              <w:rPr>
+                <w:rFonts w:asciiTheme="minorHAnsi" w:hAnsiTheme="minorHAnsi" w:cstheme="minorHAnsi"/>
+                <w:sz w:val="24"/>
+                <w:szCs w:val="24"/>
+              </w:rPr>
+              <w:t> unit/</w:t>
+            </w:r>
+            <w:proofErr w:type="spellStart"/>
+            <w:r>
+              <w:rPr>
+                <w:rFonts w:asciiTheme="minorHAnsi" w:hAnsiTheme="minorHAnsi" w:cstheme="minorHAnsi"/>
+                <w:sz w:val="24"/>
+                <w:szCs w:val="24"/>
+              </w:rPr>
+              <w:t>kabid</w:t>
+            </w:r>
+            <w:proofErr w:type="spellEnd"/>
+            <w:r>
+              <w:rPr>
+                <w:rFonts w:asciiTheme="minorHAnsi" w:hAnsiTheme="minorHAnsi" w:cstheme="minorHAnsi"/>
+                <w:sz w:val="24"/>
+                <w:szCs w:val="24"/>
+              </w:rPr>
+              <w:t>/</w:t>
+            </w:r>
+            <w:proofErr w:type="spellStart"/>
+            <w:r>
+              <w:rPr>
+                <w:rFonts w:asciiTheme="minorHAnsi" w:hAnsiTheme="minorHAnsi" w:cstheme="minorHAnsi"/>
+                <w:sz w:val="24"/>
+                <w:szCs w:val="24"/>
+              </w:rPr>
+              <w:t>direktur</w:t>
+            </w:r>
+            <w:proofErr w:type="spellEnd"/>
+            <w:r>
+              <w:rPr>
+                <w:rFonts w:asciiTheme="minorHAnsi" w:hAnsiTheme="minorHAnsi" w:cstheme="minorHAnsi"/>
+                <w:sz w:val="24"/>
+                <w:szCs w:val="24"/>
+              </w:rPr>
+              <w:t xml:space="preserve">, </w:t>
+            </w:r>
+            <w:proofErr w:type="spellStart"/>
+            <w:r>
+              <w:rPr>
+                <w:rFonts w:asciiTheme="minorHAnsi" w:hAnsiTheme="minorHAnsi" w:cstheme="minorHAnsi"/>
+                <w:sz w:val="24"/>
+                <w:szCs w:val="24"/>
+              </w:rPr>
+              <w:t>nempel</w:t>
+            </w:r>
+            <w:proofErr w:type="spellEnd"/>
+            <w:r>
+              <w:rPr>
+                <w:rFonts w:asciiTheme="minorHAnsi" w:hAnsiTheme="minorHAnsi" w:cstheme="minorHAnsi"/>
+                <w:sz w:val="24"/>
+                <w:szCs w:val="24"/>
+              </w:rPr>
+              <w:t xml:space="preserve"> </w:t>
+            </w:r>
+            <w:proofErr w:type="spellStart"/>
+            <w:r>
+              <w:rPr>
+                <w:rFonts w:asciiTheme="minorHAnsi" w:hAnsiTheme="minorHAnsi" w:cstheme="minorHAnsi"/>
+                <w:sz w:val="24"/>
+                <w:szCs w:val="24"/>
+              </w:rPr>
+              <w:t>ke</w:t>
+            </w:r>
+            <w:proofErr w:type="spellEnd"/>
+            <w:r>
+              <w:rPr>
+                <w:rFonts w:asciiTheme="minorHAnsi" w:hAnsiTheme="minorHAnsi" w:cstheme="minorHAnsi"/>
+                <w:sz w:val="24"/>
+                <w:szCs w:val="24"/>
+              </w:rPr>
+              <w:t xml:space="preserve"> </w:t>
+            </w:r>
+            <w:proofErr w:type="spellStart"/>
+            <w:r>
+              <w:rPr>
+                <w:rFonts w:asciiTheme="minorHAnsi" w:hAnsiTheme="minorHAnsi" w:cstheme="minorHAnsi"/>
+                <w:sz w:val="24"/>
+                <w:szCs w:val="24"/>
+              </w:rPr>
+              <w:t>tabel</w:t>
+            </w:r>
+            <w:proofErr w:type="spellEnd"/>
+            <w:r>
+              <w:rPr>
+                <w:rFonts w:asciiTheme="minorHAnsi" w:hAnsiTheme="minorHAnsi" w:cstheme="minorHAnsi"/>
+                <w:sz w:val="24"/>
+                <w:szCs w:val="24"/>
+              </w:rPr>
+              <w:t> </w:t>
+            </w:r>
+            <w:proofErr w:type="spellStart"/>
+            <w:r>
+              <w:rPr>
+                <w:rFonts w:asciiTheme="minorHAnsi" w:hAnsiTheme="minorHAnsi" w:cstheme="minorHAnsi"/>
+                <w:sz w:val="24"/>
+                <w:szCs w:val="24"/>
+              </w:rPr>
+              <w:t>permohonan</w:t>
+            </w:r>
+            <w:proofErr w:type="spellEnd"/>
+            <w:r>
+              <w:rPr>
+                <w:rFonts w:asciiTheme="minorHAnsi" w:hAnsiTheme="minorHAnsi" w:cstheme="minorHAnsi"/>
+                <w:sz w:val="24"/>
+                <w:szCs w:val="24"/>
+              </w:rPr>
+              <w:t> </w:t>
+            </w:r>
+            <w:proofErr w:type="spellStart"/>
+            <w:r>
+              <w:rPr>
+                <w:rFonts w:asciiTheme="minorHAnsi" w:hAnsiTheme="minorHAnsi" w:cstheme="minorHAnsi"/>
+                <w:sz w:val="24"/>
+                <w:szCs w:val="24"/>
+              </w:rPr>
+              <w:t>spesifik</w:t>
+            </w:r>
+            <w:proofErr w:type="spellEnd"/>
+          </w:p>
+        </w:tc>
+      </w:tr>
+    </w:tbl>
+    <w:p>
+      <w:pPr>
+        <w:pStyle w:val="ListParagraph"/>
+        <w:spacing w:after="90"/>
+        <w:ind w:left="720"/>
+        <w:rPr>
+          <w:rFonts w:asciiTheme="minorHAnsi" w:hAnsiTheme="minorHAnsi" w:cstheme="minorHAnsi"/>
+          <w:sz w:val="24"/>
+          <w:szCs w:val="24"/>
+        </w:rPr>
+      </w:pPr>
     </w:p>
     <w:sectPr>
       <w:pgSz w:w="11906" w:h="16838"/>

</xml_diff>